<commit_message>
Format App.vue template and update modelo.docx
Apply non-functional formatting in src/App.vue: tidy up template markup (remove stray semicolons in inline styles, expand long attributes/elements to multiple lines for readability), reformat ufs and estadosCivis arrays to multi-line, and adjust some spacing. Also update the binary public/modelo.docx. No behavioral or logic changes intended; this is a readability/formatting cleanup and a docx asset update.
</commit_message>
<xml_diff>
--- a/public/modelo.docx
+++ b/public/modelo.docx
@@ -12,8 +12,6 @@
           <w:sz w:val="40"/>
         </w:rPr>
       </w:pPr>
-      <w:bookmarkStart w:id="0" w:name="_GoBack"/>
-      <w:bookmarkEnd w:id="0"/>
       <w:r>
         <w:rPr>
           <w:rFonts w:ascii="Gill Sans MT" w:hAnsi="Gill Sans MT"/>
@@ -74,7 +72,7 @@
                 <w:rFonts w:eastAsia="Times New Roman"/>
               </w:rPr>
             </w:pPr>
-            <w:bookmarkStart w:id="1" w:name="_Hlk169251090"/>
+            <w:bookmarkStart w:id="0" w:name="_Hlk169251090"/>
             <w:r>
               <w:rPr>
                 <w:rFonts w:eastAsia="Times New Roman"/>
@@ -89,45 +87,30 @@
             </w:r>
           </w:p>
         </w:tc>
-        <w:sdt>
-          <w:sdtPr>
-            <w:rPr>
-              <w:rFonts w:eastAsia="Times New Roman"/>
-            </w:rPr>
-            <w:id w:val="-551772147"/>
-            <w:placeholder>
-              <w:docPart w:val="F3A7F4FAD40B44EF967D9C55057DBDC2"/>
-            </w:placeholder>
-            <w:text/>
-          </w:sdtPr>
-          <w:sdtEndPr/>
-          <w:sdtContent>
-            <w:tc>
-              <w:tcPr>
-                <w:tcW w:w="3981" w:type="pct"/>
-                <w:vAlign w:val="center"/>
-              </w:tcPr>
-              <w:p>
-                <w:pPr>
-                  <w:autoSpaceDE w:val="0"/>
-                  <w:autoSpaceDN w:val="0"/>
-                  <w:adjustRightInd w:val="0"/>
-                  <w:spacing w:beforeAutospacing="0"/>
-                  <w:ind w:left="-107"/>
-                  <w:rPr>
-                    <w:rFonts w:eastAsia="Times New Roman"/>
-                  </w:rPr>
-                </w:pPr>
-                <w:r>
-                  <w:rPr>
-                    <w:rFonts w:eastAsia="Times New Roman"/>
-                  </w:rPr>
-                  <w:t>{NomeLocador}</w:t>
-                </w:r>
-              </w:p>
-            </w:tc>
-          </w:sdtContent>
-        </w:sdt>
+        <w:tc>
+          <w:tcPr>
+            <w:tcW w:w="3981" w:type="pct"/>
+            <w:vAlign w:val="center"/>
+          </w:tcPr>
+          <w:p>
+            <w:pPr>
+              <w:autoSpaceDE w:val="0"/>
+              <w:autoSpaceDN w:val="0"/>
+              <w:adjustRightInd w:val="0"/>
+              <w:spacing w:beforeAutospacing="0"/>
+              <w:ind w:left="-107"/>
+              <w:rPr>
+                <w:rFonts w:eastAsia="Times New Roman"/>
+              </w:rPr>
+            </w:pPr>
+            <w:r>
+              <w:rPr>
+                <w:rFonts w:eastAsia="Times New Roman"/>
+              </w:rPr>
+              <w:t>{NomeLocador}</w:t>
+            </w:r>
+          </w:p>
+        </w:tc>
       </w:tr>
       <w:tr>
         <w:tc>
@@ -154,45 +137,30 @@
             </w:r>
           </w:p>
         </w:tc>
-        <w:sdt>
-          <w:sdtPr>
-            <w:rPr>
-              <w:rFonts w:eastAsia="Times New Roman"/>
-            </w:rPr>
-            <w:id w:val="-625997007"/>
-            <w:placeholder>
-              <w:docPart w:val="45F5F3A12813424DBA42D293A84D9F56"/>
-            </w:placeholder>
-            <w:text/>
-          </w:sdtPr>
-          <w:sdtEndPr/>
-          <w:sdtContent>
-            <w:tc>
-              <w:tcPr>
-                <w:tcW w:w="3981" w:type="pct"/>
-                <w:vAlign w:val="center"/>
-              </w:tcPr>
-              <w:p>
-                <w:pPr>
-                  <w:autoSpaceDE w:val="0"/>
-                  <w:autoSpaceDN w:val="0"/>
-                  <w:adjustRightInd w:val="0"/>
-                  <w:spacing w:beforeAutospacing="0"/>
-                  <w:ind w:left="-107"/>
-                  <w:rPr>
-                    <w:rFonts w:eastAsia="Times New Roman"/>
-                  </w:rPr>
-                </w:pPr>
-                <w:r>
-                  <w:rPr>
-                    <w:rFonts w:eastAsia="Times New Roman"/>
-                  </w:rPr>
-                  <w:t>{NacionalizadeLocador}</w:t>
-                </w:r>
-              </w:p>
-            </w:tc>
-          </w:sdtContent>
-        </w:sdt>
+        <w:tc>
+          <w:tcPr>
+            <w:tcW w:w="3981" w:type="pct"/>
+            <w:vAlign w:val="center"/>
+          </w:tcPr>
+          <w:p>
+            <w:pPr>
+              <w:autoSpaceDE w:val="0"/>
+              <w:autoSpaceDN w:val="0"/>
+              <w:adjustRightInd w:val="0"/>
+              <w:spacing w:beforeAutospacing="0"/>
+              <w:ind w:left="-107"/>
+              <w:rPr>
+                <w:rFonts w:eastAsia="Times New Roman"/>
+              </w:rPr>
+            </w:pPr>
+            <w:r>
+              <w:rPr>
+                <w:rFonts w:eastAsia="Times New Roman"/>
+              </w:rPr>
+              <w:t>{NacionalizadeLocador}</w:t>
+            </w:r>
+          </w:p>
+        </w:tc>
       </w:tr>
       <w:tr>
         <w:tc>
@@ -269,57 +237,42 @@
             </w:r>
           </w:p>
         </w:tc>
-        <w:sdt>
-          <w:sdtPr>
-            <w:rPr>
-              <w:rFonts w:eastAsia="Times New Roman"/>
-            </w:rPr>
-            <w:id w:val="-1726293820"/>
-            <w:placeholder>
-              <w:docPart w:val="F1BB48D52FB54292B90B90DB3DCCB4BD"/>
-            </w:placeholder>
-            <w:text/>
-          </w:sdtPr>
-          <w:sdtEndPr/>
-          <w:sdtContent>
-            <w:tc>
-              <w:tcPr>
-                <w:tcW w:w="3981" w:type="pct"/>
-                <w:vAlign w:val="center"/>
-              </w:tcPr>
-              <w:p>
-                <w:pPr>
-                  <w:autoSpaceDE w:val="0"/>
-                  <w:autoSpaceDN w:val="0"/>
-                  <w:adjustRightInd w:val="0"/>
-                  <w:spacing w:beforeAutospacing="0"/>
-                  <w:ind w:left="-107"/>
-                  <w:rPr>
-                    <w:rFonts w:eastAsia="Times New Roman"/>
-                  </w:rPr>
-                </w:pPr>
-                <w:r>
-                  <w:rPr>
-                    <w:rFonts w:eastAsia="Times New Roman"/>
-                  </w:rPr>
-                  <w:t>{Profiss</w:t>
-                </w:r>
-                <w:r>
-                  <w:rPr>
-                    <w:rFonts w:eastAsia="Times New Roman"/>
-                  </w:rPr>
-                  <w:t>a</w:t>
-                </w:r>
-                <w:r>
-                  <w:rPr>
-                    <w:rFonts w:eastAsia="Times New Roman"/>
-                  </w:rPr>
-                  <w:t>oLocador}</w:t>
-                </w:r>
-              </w:p>
-            </w:tc>
-          </w:sdtContent>
-        </w:sdt>
+        <w:tc>
+          <w:tcPr>
+            <w:tcW w:w="3981" w:type="pct"/>
+            <w:vAlign w:val="center"/>
+          </w:tcPr>
+          <w:p>
+            <w:pPr>
+              <w:autoSpaceDE w:val="0"/>
+              <w:autoSpaceDN w:val="0"/>
+              <w:adjustRightInd w:val="0"/>
+              <w:spacing w:beforeAutospacing="0"/>
+              <w:ind w:left="-107"/>
+              <w:rPr>
+                <w:rFonts w:eastAsia="Times New Roman"/>
+              </w:rPr>
+            </w:pPr>
+            <w:r>
+              <w:rPr>
+                <w:rFonts w:eastAsia="Times New Roman"/>
+              </w:rPr>
+              <w:t>{Profiss</w:t>
+            </w:r>
+            <w:r>
+              <w:rPr>
+                <w:rFonts w:eastAsia="Times New Roman"/>
+              </w:rPr>
+              <w:t>a</w:t>
+            </w:r>
+            <w:r>
+              <w:rPr>
+                <w:rFonts w:eastAsia="Times New Roman"/>
+              </w:rPr>
+              <w:t>oLocador}</w:t>
+            </w:r>
+          </w:p>
+        </w:tc>
       </w:tr>
       <w:tr>
         <w:tc>
@@ -346,45 +299,30 @@
             </w:r>
           </w:p>
         </w:tc>
-        <w:sdt>
-          <w:sdtPr>
-            <w:rPr>
-              <w:rFonts w:eastAsia="Times New Roman"/>
-            </w:rPr>
-            <w:id w:val="-1105111237"/>
-            <w:placeholder>
-              <w:docPart w:val="DCCEB62F54AA41B8A251841466474F8C"/>
-            </w:placeholder>
-            <w:text/>
-          </w:sdtPr>
-          <w:sdtEndPr/>
-          <w:sdtContent>
-            <w:tc>
-              <w:tcPr>
-                <w:tcW w:w="3981" w:type="pct"/>
-                <w:vAlign w:val="center"/>
-              </w:tcPr>
-              <w:p>
-                <w:pPr>
-                  <w:autoSpaceDE w:val="0"/>
-                  <w:autoSpaceDN w:val="0"/>
-                  <w:adjustRightInd w:val="0"/>
-                  <w:spacing w:beforeAutospacing="0"/>
-                  <w:ind w:left="-107"/>
-                  <w:rPr>
-                    <w:rFonts w:eastAsia="Times New Roman"/>
-                  </w:rPr>
-                </w:pPr>
-                <w:r>
-                  <w:rPr>
-                    <w:rFonts w:eastAsia="Times New Roman"/>
-                  </w:rPr>
-                  <w:t>{CPFLocador}</w:t>
-                </w:r>
-              </w:p>
-            </w:tc>
-          </w:sdtContent>
-        </w:sdt>
+        <w:tc>
+          <w:tcPr>
+            <w:tcW w:w="3981" w:type="pct"/>
+            <w:vAlign w:val="center"/>
+          </w:tcPr>
+          <w:p>
+            <w:pPr>
+              <w:autoSpaceDE w:val="0"/>
+              <w:autoSpaceDN w:val="0"/>
+              <w:adjustRightInd w:val="0"/>
+              <w:spacing w:beforeAutospacing="0"/>
+              <w:ind w:left="-107"/>
+              <w:rPr>
+                <w:rFonts w:eastAsia="Times New Roman"/>
+              </w:rPr>
+            </w:pPr>
+            <w:r>
+              <w:rPr>
+                <w:rFonts w:eastAsia="Times New Roman"/>
+              </w:rPr>
+              <w:t>{CPFLocador}</w:t>
+            </w:r>
+          </w:p>
+        </w:tc>
       </w:tr>
       <w:tr>
         <w:tc>
@@ -461,40 +399,28 @@
             </w:r>
           </w:p>
         </w:tc>
-        <w:sdt>
-          <w:sdtPr>
-            <w:id w:val="-388803022"/>
-            <w:placeholder>
-              <w:docPart w:val="154D342A038E4AB6852AF0530437EF3C"/>
-            </w:placeholder>
-            <w:text w:multiLine="1"/>
-          </w:sdtPr>
-          <w:sdtEndPr/>
-          <w:sdtContent>
-            <w:tc>
-              <w:tcPr>
-                <w:tcW w:w="3981" w:type="pct"/>
-                <w:vAlign w:val="center"/>
-              </w:tcPr>
-              <w:p>
-                <w:pPr>
-                  <w:autoSpaceDE w:val="0"/>
-                  <w:autoSpaceDN w:val="0"/>
-                  <w:adjustRightInd w:val="0"/>
-                  <w:spacing w:beforeAutospacing="0"/>
-                  <w:ind w:left="-107"/>
-                  <w:rPr>
-                    <w:rFonts w:eastAsia="Times New Roman"/>
-                    <w:color w:val="FF0000"/>
-                  </w:rPr>
-                </w:pPr>
-                <w:r>
-                  <w:t>{EnderecoLocador}</w:t>
-                </w:r>
-              </w:p>
-            </w:tc>
-          </w:sdtContent>
-        </w:sdt>
+        <w:tc>
+          <w:tcPr>
+            <w:tcW w:w="3981" w:type="pct"/>
+            <w:vAlign w:val="center"/>
+          </w:tcPr>
+          <w:p>
+            <w:pPr>
+              <w:autoSpaceDE w:val="0"/>
+              <w:autoSpaceDN w:val="0"/>
+              <w:adjustRightInd w:val="0"/>
+              <w:spacing w:beforeAutospacing="0"/>
+              <w:ind w:left="-107"/>
+              <w:rPr>
+                <w:rFonts w:eastAsia="Times New Roman"/>
+                <w:color w:val="FF0000"/>
+              </w:rPr>
+            </w:pPr>
+            <w:r>
+              <w:t>{EnderecoLocador}</w:t>
+            </w:r>
+          </w:p>
+        </w:tc>
       </w:tr>
       <w:tr>
         <w:tc>
@@ -613,48 +539,33 @@
             </w:r>
           </w:p>
         </w:tc>
-        <w:sdt>
-          <w:sdtPr>
-            <w:rPr>
-              <w:rFonts w:eastAsia="Times New Roman"/>
-            </w:rPr>
-            <w:id w:val="1866794301"/>
-            <w:placeholder>
-              <w:docPart w:val="80623B6CB0C44442BA335C637B39D8FC"/>
-            </w:placeholder>
-            <w:text/>
-          </w:sdtPr>
-          <w:sdtEndPr/>
-          <w:sdtContent>
-            <w:tc>
-              <w:tcPr>
-                <w:tcW w:w="3981" w:type="pct"/>
-                <w:vAlign w:val="center"/>
-              </w:tcPr>
-              <w:p>
-                <w:pPr>
-                  <w:autoSpaceDE w:val="0"/>
-                  <w:autoSpaceDN w:val="0"/>
-                  <w:adjustRightInd w:val="0"/>
-                  <w:spacing w:beforeAutospacing="0"/>
-                  <w:ind w:left="-107"/>
-                  <w:rPr>
-                    <w:rFonts w:eastAsia="Times New Roman"/>
-                  </w:rPr>
-                </w:pPr>
-                <w:r>
-                  <w:rPr>
-                    <w:rFonts w:eastAsia="Times New Roman"/>
-                  </w:rPr>
-                  <w:t>{E-mailLocador}</w:t>
-                </w:r>
-              </w:p>
-            </w:tc>
-          </w:sdtContent>
-        </w:sdt>
+        <w:tc>
+          <w:tcPr>
+            <w:tcW w:w="3981" w:type="pct"/>
+            <w:vAlign w:val="center"/>
+          </w:tcPr>
+          <w:p>
+            <w:pPr>
+              <w:autoSpaceDE w:val="0"/>
+              <w:autoSpaceDN w:val="0"/>
+              <w:adjustRightInd w:val="0"/>
+              <w:spacing w:beforeAutospacing="0"/>
+              <w:ind w:left="-107"/>
+              <w:rPr>
+                <w:rFonts w:eastAsia="Times New Roman"/>
+              </w:rPr>
+            </w:pPr>
+            <w:r>
+              <w:rPr>
+                <w:rFonts w:eastAsia="Times New Roman"/>
+              </w:rPr>
+              <w:t>{E-mailLocador}</w:t>
+            </w:r>
+          </w:p>
+        </w:tc>
       </w:tr>
     </w:tbl>
-    <w:bookmarkEnd w:id="1"/>
+    <w:bookmarkEnd w:id="0"/>
     <w:p>
       <w:pPr>
         <w:pBdr>
@@ -714,7 +625,7 @@
                 <w:rFonts w:eastAsia="Times New Roman"/>
               </w:rPr>
             </w:pPr>
-            <w:bookmarkStart w:id="2" w:name="_Hlk167461925"/>
+            <w:bookmarkStart w:id="1" w:name="_Hlk167461925"/>
             <w:r>
               <w:rPr>
                 <w:rFonts w:eastAsia="Times New Roman"/>
@@ -729,45 +640,30 @@
             </w:r>
           </w:p>
         </w:tc>
-        <w:sdt>
-          <w:sdtPr>
-            <w:rPr>
-              <w:rFonts w:eastAsia="Times New Roman"/>
-            </w:rPr>
-            <w:id w:val="1095821155"/>
-            <w:placeholder>
-              <w:docPart w:val="34AE27DFE71D450C87C802E5D980BC74"/>
-            </w:placeholder>
-            <w:text/>
-          </w:sdtPr>
-          <w:sdtEndPr/>
-          <w:sdtContent>
-            <w:tc>
-              <w:tcPr>
-                <w:tcW w:w="3981" w:type="pct"/>
-                <w:vAlign w:val="center"/>
-              </w:tcPr>
-              <w:p>
-                <w:pPr>
-                  <w:autoSpaceDE w:val="0"/>
-                  <w:autoSpaceDN w:val="0"/>
-                  <w:adjustRightInd w:val="0"/>
-                  <w:spacing w:beforeAutospacing="0"/>
-                  <w:ind w:left="-107"/>
-                  <w:rPr>
-                    <w:rFonts w:eastAsia="Times New Roman"/>
-                  </w:rPr>
-                </w:pPr>
-                <w:r>
-                  <w:rPr>
-                    <w:rFonts w:eastAsia="Times New Roman"/>
-                  </w:rPr>
-                  <w:t>{NomeLocatario}</w:t>
-                </w:r>
-              </w:p>
-            </w:tc>
-          </w:sdtContent>
-        </w:sdt>
+        <w:tc>
+          <w:tcPr>
+            <w:tcW w:w="3981" w:type="pct"/>
+            <w:vAlign w:val="center"/>
+          </w:tcPr>
+          <w:p>
+            <w:pPr>
+              <w:autoSpaceDE w:val="0"/>
+              <w:autoSpaceDN w:val="0"/>
+              <w:adjustRightInd w:val="0"/>
+              <w:spacing w:beforeAutospacing="0"/>
+              <w:ind w:left="-107"/>
+              <w:rPr>
+                <w:rFonts w:eastAsia="Times New Roman"/>
+              </w:rPr>
+            </w:pPr>
+            <w:r>
+              <w:rPr>
+                <w:rFonts w:eastAsia="Times New Roman"/>
+              </w:rPr>
+              <w:t>{NomeLocatario}</w:t>
+            </w:r>
+          </w:p>
+        </w:tc>
       </w:tr>
       <w:tr>
         <w:tc>
@@ -794,45 +690,30 @@
             </w:r>
           </w:p>
         </w:tc>
-        <w:sdt>
-          <w:sdtPr>
-            <w:rPr>
-              <w:rFonts w:eastAsia="Times New Roman"/>
-            </w:rPr>
-            <w:id w:val="1029384532"/>
-            <w:placeholder>
-              <w:docPart w:val="9804FF69A977486791AB1DEC2744F98D"/>
-            </w:placeholder>
-            <w:text/>
-          </w:sdtPr>
-          <w:sdtEndPr/>
-          <w:sdtContent>
-            <w:tc>
-              <w:tcPr>
-                <w:tcW w:w="3981" w:type="pct"/>
-                <w:vAlign w:val="center"/>
-              </w:tcPr>
-              <w:p>
-                <w:pPr>
-                  <w:autoSpaceDE w:val="0"/>
-                  <w:autoSpaceDN w:val="0"/>
-                  <w:adjustRightInd w:val="0"/>
-                  <w:spacing w:beforeAutospacing="0"/>
-                  <w:ind w:left="-107"/>
-                  <w:rPr>
-                    <w:rFonts w:eastAsia="Times New Roman"/>
-                  </w:rPr>
-                </w:pPr>
-                <w:r>
-                  <w:rPr>
-                    <w:rFonts w:eastAsia="Times New Roman"/>
-                  </w:rPr>
-                  <w:t>{NacionalidadeLocatario}</w:t>
-                </w:r>
-              </w:p>
-            </w:tc>
-          </w:sdtContent>
-        </w:sdt>
+        <w:tc>
+          <w:tcPr>
+            <w:tcW w:w="3981" w:type="pct"/>
+            <w:vAlign w:val="center"/>
+          </w:tcPr>
+          <w:p>
+            <w:pPr>
+              <w:autoSpaceDE w:val="0"/>
+              <w:autoSpaceDN w:val="0"/>
+              <w:adjustRightInd w:val="0"/>
+              <w:spacing w:beforeAutospacing="0"/>
+              <w:ind w:left="-107"/>
+              <w:rPr>
+                <w:rFonts w:eastAsia="Times New Roman"/>
+              </w:rPr>
+            </w:pPr>
+            <w:r>
+              <w:rPr>
+                <w:rFonts w:eastAsia="Times New Roman"/>
+              </w:rPr>
+              <w:t>{NacionalidadeLocatario}</w:t>
+            </w:r>
+          </w:p>
+        </w:tc>
       </w:tr>
       <w:tr>
         <w:tc>
@@ -909,57 +790,42 @@
             </w:r>
           </w:p>
         </w:tc>
-        <w:sdt>
-          <w:sdtPr>
-            <w:rPr>
-              <w:rFonts w:eastAsia="Times New Roman"/>
-            </w:rPr>
-            <w:id w:val="-1821874910"/>
-            <w:placeholder>
-              <w:docPart w:val="1FCAF0F37CF34C6DB790933AE39503C7"/>
-            </w:placeholder>
-            <w:text/>
-          </w:sdtPr>
-          <w:sdtEndPr/>
-          <w:sdtContent>
-            <w:tc>
-              <w:tcPr>
-                <w:tcW w:w="3981" w:type="pct"/>
-                <w:vAlign w:val="center"/>
-              </w:tcPr>
-              <w:p>
-                <w:pPr>
-                  <w:autoSpaceDE w:val="0"/>
-                  <w:autoSpaceDN w:val="0"/>
-                  <w:adjustRightInd w:val="0"/>
-                  <w:spacing w:beforeAutospacing="0"/>
-                  <w:ind w:left="-107"/>
-                  <w:rPr>
-                    <w:rFonts w:eastAsia="Times New Roman"/>
-                  </w:rPr>
-                </w:pPr>
-                <w:r>
-                  <w:rPr>
-                    <w:rFonts w:eastAsia="Times New Roman"/>
-                  </w:rPr>
-                  <w:t>{Profiss</w:t>
-                </w:r>
-                <w:r>
-                  <w:rPr>
-                    <w:rFonts w:eastAsia="Times New Roman"/>
-                  </w:rPr>
-                  <w:t>a</w:t>
-                </w:r>
-                <w:r>
-                  <w:rPr>
-                    <w:rFonts w:eastAsia="Times New Roman"/>
-                  </w:rPr>
-                  <w:t>oLocatario}</w:t>
-                </w:r>
-              </w:p>
-            </w:tc>
-          </w:sdtContent>
-        </w:sdt>
+        <w:tc>
+          <w:tcPr>
+            <w:tcW w:w="3981" w:type="pct"/>
+            <w:vAlign w:val="center"/>
+          </w:tcPr>
+          <w:p>
+            <w:pPr>
+              <w:autoSpaceDE w:val="0"/>
+              <w:autoSpaceDN w:val="0"/>
+              <w:adjustRightInd w:val="0"/>
+              <w:spacing w:beforeAutospacing="0"/>
+              <w:ind w:left="-107"/>
+              <w:rPr>
+                <w:rFonts w:eastAsia="Times New Roman"/>
+              </w:rPr>
+            </w:pPr>
+            <w:r>
+              <w:rPr>
+                <w:rFonts w:eastAsia="Times New Roman"/>
+              </w:rPr>
+              <w:t>{Profiss</w:t>
+            </w:r>
+            <w:r>
+              <w:rPr>
+                <w:rFonts w:eastAsia="Times New Roman"/>
+              </w:rPr>
+              <w:t>a</w:t>
+            </w:r>
+            <w:r>
+              <w:rPr>
+                <w:rFonts w:eastAsia="Times New Roman"/>
+              </w:rPr>
+              <w:t>oLocatario}</w:t>
+            </w:r>
+          </w:p>
+        </w:tc>
       </w:tr>
       <w:tr>
         <w:tc>
@@ -986,45 +852,30 @@
             </w:r>
           </w:p>
         </w:tc>
-        <w:sdt>
-          <w:sdtPr>
-            <w:rPr>
-              <w:rFonts w:eastAsia="Times New Roman"/>
-            </w:rPr>
-            <w:id w:val="318698143"/>
-            <w:placeholder>
-              <w:docPart w:val="CF6EC5BF030542CAAE98B2FC40B47F83"/>
-            </w:placeholder>
-            <w:text/>
-          </w:sdtPr>
-          <w:sdtEndPr/>
-          <w:sdtContent>
-            <w:tc>
-              <w:tcPr>
-                <w:tcW w:w="3981" w:type="pct"/>
-                <w:vAlign w:val="center"/>
-              </w:tcPr>
-              <w:p>
-                <w:pPr>
-                  <w:autoSpaceDE w:val="0"/>
-                  <w:autoSpaceDN w:val="0"/>
-                  <w:adjustRightInd w:val="0"/>
-                  <w:spacing w:beforeAutospacing="0"/>
-                  <w:ind w:left="-107"/>
-                  <w:rPr>
-                    <w:rFonts w:eastAsia="Times New Roman"/>
-                  </w:rPr>
-                </w:pPr>
-                <w:r>
-                  <w:rPr>
-                    <w:rFonts w:eastAsia="Times New Roman"/>
-                  </w:rPr>
-                  <w:t>{CPFLocatario}</w:t>
-                </w:r>
-              </w:p>
-            </w:tc>
-          </w:sdtContent>
-        </w:sdt>
+        <w:tc>
+          <w:tcPr>
+            <w:tcW w:w="3981" w:type="pct"/>
+            <w:vAlign w:val="center"/>
+          </w:tcPr>
+          <w:p>
+            <w:pPr>
+              <w:autoSpaceDE w:val="0"/>
+              <w:autoSpaceDN w:val="0"/>
+              <w:adjustRightInd w:val="0"/>
+              <w:spacing w:beforeAutospacing="0"/>
+              <w:ind w:left="-107"/>
+              <w:rPr>
+                <w:rFonts w:eastAsia="Times New Roman"/>
+              </w:rPr>
+            </w:pPr>
+            <w:r>
+              <w:rPr>
+                <w:rFonts w:eastAsia="Times New Roman"/>
+              </w:rPr>
+              <w:t>{CPFLocatario}</w:t>
+            </w:r>
+          </w:p>
+        </w:tc>
       </w:tr>
       <w:tr>
         <w:tc>
@@ -1067,27 +918,12 @@
                 <w:rFonts w:eastAsia="Times New Roman"/>
               </w:rPr>
             </w:pPr>
-            <w:sdt>
-              <w:sdtPr>
-                <w:rPr>
-                  <w:rFonts w:eastAsia="Times New Roman"/>
-                </w:rPr>
-                <w:id w:val="604927646"/>
-                <w:placeholder>
-                  <w:docPart w:val="DE328453E8AD4EF485DD12097C0AD9CF"/>
-                </w:placeholder>
-                <w:text/>
-              </w:sdtPr>
-              <w:sdtEndPr/>
-              <w:sdtContent>
-                <w:r>
-                  <w:rPr>
-                    <w:rFonts w:eastAsia="Times New Roman"/>
-                  </w:rPr>
-                  <w:t>{RGLocatario}</w:t>
-                </w:r>
-              </w:sdtContent>
-            </w:sdt>
+            <w:r>
+              <w:rPr>
+                <w:rFonts w:eastAsia="Times New Roman"/>
+              </w:rPr>
+              <w:t>{RGLocatario}</w:t>
+            </w:r>
             <w:r>
               <w:rPr>
                 <w:rFonts w:eastAsia="Times New Roman"/>
@@ -1122,39 +958,27 @@
             </w:r>
           </w:p>
         </w:tc>
-        <w:sdt>
-          <w:sdtPr>
-            <w:id w:val="1900247796"/>
-            <w:placeholder>
-              <w:docPart w:val="F8645BFEC27B4D44866DD3516027E4B2"/>
-            </w:placeholder>
-            <w:text w:multiLine="1"/>
-          </w:sdtPr>
-          <w:sdtEndPr/>
-          <w:sdtContent>
-            <w:tc>
-              <w:tcPr>
-                <w:tcW w:w="3981" w:type="pct"/>
-                <w:vAlign w:val="center"/>
-              </w:tcPr>
-              <w:p>
-                <w:pPr>
-                  <w:autoSpaceDE w:val="0"/>
-                  <w:autoSpaceDN w:val="0"/>
-                  <w:adjustRightInd w:val="0"/>
-                  <w:spacing w:beforeAutospacing="0"/>
-                  <w:ind w:left="-107"/>
-                  <w:rPr>
-                    <w:rFonts w:eastAsia="Times New Roman"/>
-                  </w:rPr>
-                </w:pPr>
-                <w:r>
-                  <w:t>{EnderecoLocatario}</w:t>
-                </w:r>
-              </w:p>
-            </w:tc>
-          </w:sdtContent>
-        </w:sdt>
+        <w:tc>
+          <w:tcPr>
+            <w:tcW w:w="3981" w:type="pct"/>
+            <w:vAlign w:val="center"/>
+          </w:tcPr>
+          <w:p>
+            <w:pPr>
+              <w:autoSpaceDE w:val="0"/>
+              <w:autoSpaceDN w:val="0"/>
+              <w:adjustRightInd w:val="0"/>
+              <w:spacing w:beforeAutospacing="0"/>
+              <w:ind w:left="-107"/>
+              <w:rPr>
+                <w:rFonts w:eastAsia="Times New Roman"/>
+              </w:rPr>
+            </w:pPr>
+            <w:r>
+              <w:t>{EnderecoLocatario}</w:t>
+            </w:r>
+          </w:p>
+        </w:tc>
       </w:tr>
       <w:tr>
         <w:tc>
@@ -1273,48 +1097,33 @@
             </w:r>
           </w:p>
         </w:tc>
-        <w:sdt>
-          <w:sdtPr>
-            <w:rPr>
-              <w:rFonts w:eastAsia="Times New Roman"/>
-            </w:rPr>
-            <w:id w:val="-2077117961"/>
-            <w:placeholder>
-              <w:docPart w:val="C5497176C40542C88D9C06E3599B5759"/>
-            </w:placeholder>
-            <w:text/>
-          </w:sdtPr>
-          <w:sdtEndPr/>
-          <w:sdtContent>
-            <w:tc>
-              <w:tcPr>
-                <w:tcW w:w="3981" w:type="pct"/>
-                <w:vAlign w:val="center"/>
-              </w:tcPr>
-              <w:p>
-                <w:pPr>
-                  <w:autoSpaceDE w:val="0"/>
-                  <w:autoSpaceDN w:val="0"/>
-                  <w:adjustRightInd w:val="0"/>
-                  <w:spacing w:beforeAutospacing="0"/>
-                  <w:ind w:left="-107"/>
-                  <w:rPr>
-                    <w:rFonts w:eastAsia="Times New Roman"/>
-                  </w:rPr>
-                </w:pPr>
-                <w:r>
-                  <w:rPr>
-                    <w:rFonts w:eastAsia="Times New Roman"/>
-                  </w:rPr>
-                  <w:t>{E-mailLocatario}</w:t>
-                </w:r>
-              </w:p>
-            </w:tc>
-          </w:sdtContent>
-        </w:sdt>
+        <w:tc>
+          <w:tcPr>
+            <w:tcW w:w="3981" w:type="pct"/>
+            <w:vAlign w:val="center"/>
+          </w:tcPr>
+          <w:p>
+            <w:pPr>
+              <w:autoSpaceDE w:val="0"/>
+              <w:autoSpaceDN w:val="0"/>
+              <w:adjustRightInd w:val="0"/>
+              <w:spacing w:beforeAutospacing="0"/>
+              <w:ind w:left="-107"/>
+              <w:rPr>
+                <w:rFonts w:eastAsia="Times New Roman"/>
+              </w:rPr>
+            </w:pPr>
+            <w:r>
+              <w:rPr>
+                <w:rFonts w:eastAsia="Times New Roman"/>
+              </w:rPr>
+              <w:t>{E-mailLocatario}</w:t>
+            </w:r>
+          </w:p>
+        </w:tc>
       </w:tr>
     </w:tbl>
-    <w:bookmarkEnd w:id="2"/>
+    <w:bookmarkEnd w:id="1"/>
     <w:p>
       <w:pPr>
         <w:pBdr>
@@ -1705,7 +1514,7 @@
                 <w:rFonts w:eastAsia="Times New Roman"/>
               </w:rPr>
             </w:pPr>
-            <w:bookmarkStart w:id="3" w:name="_Hlk163802821"/>
+            <w:bookmarkStart w:id="2" w:name="_Hlk163802821"/>
             <w:r>
               <w:rPr>
                 <w:szCs w:val="18"/>
@@ -1714,57 +1523,42 @@
             </w:r>
           </w:p>
         </w:tc>
-        <w:sdt>
-          <w:sdtPr>
-            <w:rPr>
-              <w:rFonts w:eastAsia="Times New Roman"/>
-            </w:rPr>
-            <w:id w:val="-1072511148"/>
-            <w:placeholder>
-              <w:docPart w:val="6E87224A90E144E9B54BB898B7BBBA0C"/>
-            </w:placeholder>
-            <w:text/>
-          </w:sdtPr>
-          <w:sdtEndPr/>
-          <w:sdtContent>
-            <w:tc>
-              <w:tcPr>
-                <w:tcW w:w="3981" w:type="pct"/>
-                <w:vAlign w:val="center"/>
-              </w:tcPr>
-              <w:p>
-                <w:pPr>
-                  <w:autoSpaceDE w:val="0"/>
-                  <w:autoSpaceDN w:val="0"/>
-                  <w:adjustRightInd w:val="0"/>
-                  <w:spacing w:beforeAutospacing="0"/>
-                  <w:ind w:left="-107"/>
-                  <w:rPr>
-                    <w:rFonts w:eastAsia="Times New Roman"/>
-                  </w:rPr>
-                </w:pPr>
-                <w:r>
-                  <w:rPr>
-                    <w:rFonts w:eastAsia="Times New Roman"/>
-                  </w:rPr>
-                  <w:t>{</w:t>
-                </w:r>
-                <w:r>
-                  <w:rPr>
-                    <w:rFonts w:eastAsia="Times New Roman"/>
-                  </w:rPr>
-                  <w:t>NomeCorretor</w:t>
-                </w:r>
-                <w:r>
-                  <w:rPr>
-                    <w:rFonts w:eastAsia="Times New Roman"/>
-                  </w:rPr>
-                  <w:t>}</w:t>
-                </w:r>
-              </w:p>
-            </w:tc>
-          </w:sdtContent>
-        </w:sdt>
+        <w:tc>
+          <w:tcPr>
+            <w:tcW w:w="3981" w:type="pct"/>
+            <w:vAlign w:val="center"/>
+          </w:tcPr>
+          <w:p>
+            <w:pPr>
+              <w:autoSpaceDE w:val="0"/>
+              <w:autoSpaceDN w:val="0"/>
+              <w:adjustRightInd w:val="0"/>
+              <w:spacing w:beforeAutospacing="0"/>
+              <w:ind w:left="-107"/>
+              <w:rPr>
+                <w:rFonts w:eastAsia="Times New Roman"/>
+              </w:rPr>
+            </w:pPr>
+            <w:r>
+              <w:rPr>
+                <w:rFonts w:eastAsia="Times New Roman"/>
+              </w:rPr>
+              <w:t>{</w:t>
+            </w:r>
+            <w:r>
+              <w:rPr>
+                <w:rFonts w:eastAsia="Times New Roman"/>
+              </w:rPr>
+              <w:t>NomeCorretor</w:t>
+            </w:r>
+            <w:r>
+              <w:rPr>
+                <w:rFonts w:eastAsia="Times New Roman"/>
+              </w:rPr>
+              <w:t>}</w:t>
+            </w:r>
+          </w:p>
+        </w:tc>
       </w:tr>
       <w:tr>
         <w:tc>
@@ -1791,39 +1585,27 @@
             </w:r>
           </w:p>
         </w:tc>
-        <w:sdt>
-          <w:sdtPr>
-            <w:id w:val="-771161068"/>
-            <w:placeholder>
-              <w:docPart w:val="0052BC3DE60148BC83DBF45C97CA0818"/>
-            </w:placeholder>
-            <w:text/>
-          </w:sdtPr>
-          <w:sdtEndPr/>
-          <w:sdtContent>
-            <w:tc>
-              <w:tcPr>
-                <w:tcW w:w="3981" w:type="pct"/>
-                <w:vAlign w:val="center"/>
-              </w:tcPr>
-              <w:p>
-                <w:pPr>
-                  <w:autoSpaceDE w:val="0"/>
-                  <w:autoSpaceDN w:val="0"/>
-                  <w:adjustRightInd w:val="0"/>
-                  <w:spacing w:beforeAutospacing="0"/>
-                  <w:ind w:left="-107"/>
-                  <w:rPr>
-                    <w:rFonts w:eastAsia="Times New Roman"/>
-                  </w:rPr>
-                </w:pPr>
-                <w:r>
-                  <w:t>{CPFCorretor}</w:t>
-                </w:r>
-              </w:p>
-            </w:tc>
-          </w:sdtContent>
-        </w:sdt>
+        <w:tc>
+          <w:tcPr>
+            <w:tcW w:w="3981" w:type="pct"/>
+            <w:vAlign w:val="center"/>
+          </w:tcPr>
+          <w:p>
+            <w:pPr>
+              <w:autoSpaceDE w:val="0"/>
+              <w:autoSpaceDN w:val="0"/>
+              <w:adjustRightInd w:val="0"/>
+              <w:spacing w:beforeAutospacing="0"/>
+              <w:ind w:left="-107"/>
+              <w:rPr>
+                <w:rFonts w:eastAsia="Times New Roman"/>
+              </w:rPr>
+            </w:pPr>
+            <w:r>
+              <w:t>{CPFCorretor}</w:t>
+            </w:r>
+          </w:p>
+        </w:tc>
       </w:tr>
       <w:tr>
         <w:tc>
@@ -1850,59 +1632,44 @@
             </w:r>
           </w:p>
         </w:tc>
-        <w:sdt>
-          <w:sdtPr>
-            <w:rPr>
-              <w:rFonts w:eastAsia="Times New Roman"/>
-            </w:rPr>
-            <w:id w:val="1035694791"/>
-            <w:placeholder>
-              <w:docPart w:val="10C515A1ACF741AB91C58EE91568B185"/>
-            </w:placeholder>
-            <w:text/>
-          </w:sdtPr>
-          <w:sdtEndPr/>
-          <w:sdtContent>
-            <w:tc>
-              <w:tcPr>
-                <w:tcW w:w="3981" w:type="pct"/>
-                <w:vAlign w:val="center"/>
-              </w:tcPr>
-              <w:p>
-                <w:pPr>
-                  <w:autoSpaceDE w:val="0"/>
-                  <w:autoSpaceDN w:val="0"/>
-                  <w:adjustRightInd w:val="0"/>
-                  <w:spacing w:beforeAutospacing="0"/>
-                  <w:ind w:left="-107"/>
-                  <w:rPr>
-                    <w:rFonts w:eastAsia="Times New Roman"/>
-                  </w:rPr>
-                </w:pPr>
-                <w:r>
-                  <w:rPr>
-                    <w:rFonts w:eastAsia="Times New Roman"/>
-                  </w:rPr>
-                  <w:t>{</w:t>
-                </w:r>
-                <w:r>
-                  <w:rPr>
-                    <w:rFonts w:eastAsia="Times New Roman"/>
-                  </w:rPr>
-                  <w:t>CreciCorretor</w:t>
-                </w:r>
-                <w:r>
-                  <w:rPr>
-                    <w:rFonts w:eastAsia="Times New Roman"/>
-                  </w:rPr>
-                  <w:t>}</w:t>
-                </w:r>
-              </w:p>
-            </w:tc>
-          </w:sdtContent>
-        </w:sdt>
+        <w:tc>
+          <w:tcPr>
+            <w:tcW w:w="3981" w:type="pct"/>
+            <w:vAlign w:val="center"/>
+          </w:tcPr>
+          <w:p>
+            <w:pPr>
+              <w:autoSpaceDE w:val="0"/>
+              <w:autoSpaceDN w:val="0"/>
+              <w:adjustRightInd w:val="0"/>
+              <w:spacing w:beforeAutospacing="0"/>
+              <w:ind w:left="-107"/>
+              <w:rPr>
+                <w:rFonts w:eastAsia="Times New Roman"/>
+              </w:rPr>
+            </w:pPr>
+            <w:r>
+              <w:rPr>
+                <w:rFonts w:eastAsia="Times New Roman"/>
+              </w:rPr>
+              <w:t>{</w:t>
+            </w:r>
+            <w:r>
+              <w:rPr>
+                <w:rFonts w:eastAsia="Times New Roman"/>
+              </w:rPr>
+              <w:t>CreciCorretor</w:t>
+            </w:r>
+            <w:r>
+              <w:rPr>
+                <w:rFonts w:eastAsia="Times New Roman"/>
+              </w:rPr>
+              <w:t>}</w:t>
+            </w:r>
+          </w:p>
+        </w:tc>
       </w:tr>
-      <w:bookmarkEnd w:id="3"/>
+      <w:bookmarkEnd w:id="2"/>
     </w:tbl>
     <w:p/>
     <w:p>
@@ -1991,7 +1758,6 @@
           <w:sz w:val="20"/>
           <w:szCs w:val="20"/>
         </w:rPr>
-        <w:lastRenderedPageBreak/>
         <w:t xml:space="preserve">O presente </w:t>
       </w:r>
       <w:r>
@@ -2134,6 +1900,7 @@
           <w:sz w:val="20"/>
           <w:szCs w:val="20"/>
         </w:rPr>
+        <w:lastRenderedPageBreak/>
         <w:t>Quando do início da locação será lavrado laudo de vistoria no qual constará, pormenorizadamente, a descrição da quantidade, qualidade e espécies de móveis e utensílios existentes, bem como do estado de conservação do imóvel, suas instalações hidráulicas e elétricas.</w:t>
       </w:r>
     </w:p>
@@ -2365,7 +2132,18 @@
           <w:sz w:val="20"/>
           <w:szCs w:val="20"/>
         </w:rPr>
-        <w:t>DataFimLocacao}</w:t>
+        <w:t>DataFimLocaca</w:t>
+      </w:r>
+      <w:bookmarkStart w:id="3" w:name="_GoBack"/>
+      <w:bookmarkEnd w:id="3"/>
+      <w:r>
+        <w:rPr>
+          <w:b/>
+          <w:color w:val="FF0000"/>
+          <w:sz w:val="20"/>
+          <w:szCs w:val="20"/>
+        </w:rPr>
+        <w:t>o}</w:t>
       </w:r>
       <w:r>
         <w:rPr>
@@ -3321,6 +3099,7 @@
           <w:sz w:val="20"/>
           <w:szCs w:val="20"/>
         </w:rPr>
+        <w:lastRenderedPageBreak/>
         <w:t>{DiaMensalPagamentoAluguel}</w:t>
       </w:r>
       <w:r>
@@ -4321,7 +4100,6 @@
         <w:jc w:val="both"/>
       </w:pPr>
       <w:r>
-        <w:lastRenderedPageBreak/>
         <w:t xml:space="preserve">CLÁUSULA </w:t>
       </w:r>
       <w:r>
@@ -5414,7 +5192,6 @@
         <w:jc w:val="both"/>
       </w:pPr>
       <w:r>
-        <w:lastRenderedPageBreak/>
         <w:t xml:space="preserve">CLÁUSULA </w:t>
       </w:r>
       <w:r>
@@ -8149,26 +7926,14 @@
         <w:t>}</w:t>
       </w:r>
     </w:p>
-    <w:sdt>
-      <w:sdtPr>
-        <w:id w:val="-91086139"/>
-        <w:placeholder>
-          <w:docPart w:val="DA6D1B3189ED424A829937D633B5A5CC"/>
-        </w:placeholder>
-        <w:text/>
-      </w:sdtPr>
-      <w:sdtEndPr/>
-      <w:sdtContent>
-        <w:p>
-          <w:pPr>
-            <w:jc w:val="center"/>
-          </w:pPr>
-          <w:r>
-            <w:t>CRECI - {CreciCorretor}</w:t>
-          </w:r>
-        </w:p>
-      </w:sdtContent>
-    </w:sdt>
+    <w:p>
+      <w:pPr>
+        <w:jc w:val="center"/>
+      </w:pPr>
+      <w:r>
+        <w:t>CRECI - {CreciCorretor}</w:t>
+      </w:r>
+    </w:p>
     <w:sectPr>
       <w:headerReference w:type="default" r:id="rId7"/>
       <w:footerReference w:type="default" r:id="rId8"/>
@@ -8503,7 +8268,7 @@
         </mc:Choice>
         <mc:Fallback>
           <w:pict>
-            <v:line w14:anchorId="028F2C47" id="Line 3" o:spid="_x0000_s1026" style="position:absolute;z-index:251659264;visibility:visible;mso-wrap-style:square;mso-wrap-distance-left:9pt;mso-wrap-distance-top:0;mso-wrap-distance-right:9pt;mso-wrap-distance-bottom:0;mso-position-horizontal:left;mso-position-horizontal-relative:margin;mso-position-vertical:absolute;mso-position-vertical-relative:text" from="0,-.2pt" to="486pt,-.2pt" o:gfxdata="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" strokeweight=".48pt">
+            <v:line w14:anchorId="287E1B4A" id="Line 3" o:spid="_x0000_s1026" style="position:absolute;z-index:251659264;visibility:visible;mso-wrap-style:square;mso-wrap-distance-left:9pt;mso-wrap-distance-top:0;mso-wrap-distance-right:9pt;mso-wrap-distance-bottom:0;mso-position-horizontal:left;mso-position-horizontal-relative:margin;mso-position-vertical:absolute;mso-position-vertical-relative:text" from="0,-.2pt" to="486pt,-.2pt" o:gfxdata="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" strokeweight=".48pt">
               <w10:wrap anchorx="margin"/>
             </v:line>
           </w:pict>
@@ -8580,7 +8345,7 @@
                 <w:sz w:val="20"/>
                 <w:szCs w:val="20"/>
               </w:rPr>
-              <w:t>1</w:t>
+              <w:t>2</w:t>
             </w:r>
             <w:r>
               <w:rPr>
@@ -8782,7 +8547,7 @@
         </mc:Choice>
         <mc:Fallback>
           <w:pict>
-            <v:shape w14:anchorId="2E97E5EC" id="Graphic 1" o:spid="_x0000_s1026" style="position:absolute;margin-left:26.15pt;margin-top:27.55pt;width:537.15pt;height:16.45pt;z-index:251653120;visibility:visible;mso-wrap-style:square;mso-wrap-distance-left:0;mso-wrap-distance-top:0;mso-wrap-distance-right:0;mso-wrap-distance-bottom:0;mso-position-horizontal:absolute;mso-position-horizontal-relative:page;mso-position-vertical:absolute;mso-position-vertical-relative:page;v-text-anchor:top" coordsize="6821805,208915" o:gfxdata="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" path="m6821805,l,,,208915r6821805,l6821805,xe" fillcolor="#dc1c2d" stroked="f">
+            <v:shape w14:anchorId="4626AE5C" id="Graphic 1" o:spid="_x0000_s1026" style="position:absolute;margin-left:26.15pt;margin-top:27.55pt;width:537.15pt;height:16.45pt;z-index:251653120;visibility:visible;mso-wrap-style:square;mso-wrap-distance-left:0;mso-wrap-distance-top:0;mso-wrap-distance-right:0;mso-wrap-distance-bottom:0;mso-position-horizontal:absolute;mso-position-horizontal-relative:page;mso-position-vertical:absolute;mso-position-vertical-relative:page;v-text-anchor:top" coordsize="6821805,208915" o:gfxdata="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" path="m6821805,l,,,208915r6821805,l6821805,xe" fillcolor="#dc1c2d" stroked="f">
               <v:path arrowok="t"/>
               <w10:wrap anchorx="page" anchory="page"/>
             </v:shape>
@@ -9139,7 +8904,7 @@
 
 <file path=word/numbering.xml><?xml version="1.0" encoding="utf-8"?>
 <w:numbering xmlns:wpc="http://schemas.microsoft.com/office/word/2010/wordprocessingCanvas" xmlns:mc="http://schemas.openxmlformats.org/markup-compatibility/2006" xmlns:o="urn:schemas-microsoft-com:office:office" xmlns:r="http://schemas.openxmlformats.org/officeDocument/2006/relationships" xmlns:m="http://schemas.openxmlformats.org/officeDocument/2006/math" xmlns:v="urn:schemas-microsoft-com:vml" xmlns:wp14="http://schemas.microsoft.com/office/word/2010/wordprocessingDrawing" xmlns:wp="http://schemas.openxmlformats.org/drawingml/2006/wordprocessingDrawing" xmlns:w10="urn:schemas-microsoft-com:office:word" xmlns:w="http://schemas.openxmlformats.org/wordprocessingml/2006/main" xmlns:w14="http://schemas.microsoft.com/office/word/2010/wordml" xmlns:w15="http://schemas.microsoft.com/office/word/2012/wordml" xmlns:wpg="http://schemas.microsoft.com/office/word/2010/wordprocessingGroup" xmlns:wpi="http://schemas.microsoft.com/office/word/2010/wordprocessingInk" xmlns:wne="http://schemas.microsoft.com/office/word/2006/wordml" xmlns:wps="http://schemas.microsoft.com/office/word/2010/wordprocessingShape" mc:Ignorable="w14 w15 wp14">
-  <w:abstractNum w:abstractNumId="0" w15:restartNumberingAfterBreak="0">
+  <w:abstractNum w:abstractNumId="0">
     <w:nsid w:val="118A1E96"/>
     <w:multiLevelType w:val="hybridMultilevel"/>
     <w:tmpl w:val="13B20CDE"/>
@@ -9252,7 +9017,7 @@
       </w:rPr>
     </w:lvl>
   </w:abstractNum>
-  <w:abstractNum w:abstractNumId="1" w15:restartNumberingAfterBreak="0">
+  <w:abstractNum w:abstractNumId="1">
     <w:nsid w:val="1D7F5B5E"/>
     <w:multiLevelType w:val="hybridMultilevel"/>
     <w:tmpl w:val="F6A47E7A"/>
@@ -9383,7 +9148,7 @@
       </w:rPr>
     </w:lvl>
   </w:abstractNum>
-  <w:abstractNum w:abstractNumId="2" w15:restartNumberingAfterBreak="0">
+  <w:abstractNum w:abstractNumId="2">
     <w:nsid w:val="20BD187A"/>
     <w:multiLevelType w:val="multilevel"/>
     <w:tmpl w:val="7FD44E8C"/>
@@ -9505,7 +9270,7 @@
       </w:rPr>
     </w:lvl>
   </w:abstractNum>
-  <w:abstractNum w:abstractNumId="3" w15:restartNumberingAfterBreak="0">
+  <w:abstractNum w:abstractNumId="3">
     <w:nsid w:val="52C76858"/>
     <w:multiLevelType w:val="hybridMultilevel"/>
     <w:tmpl w:val="A204E7F8"/>
@@ -10263,6 +10028,7 @@
       <w:lang w:val="pt-BR" w:eastAsia="pt-BR"/>
     </w:rPr>
     <w:tblPr>
+      <w:tblInd w:w="0" w:type="dxa"/>
       <w:tblBorders>
         <w:top w:val="single" w:sz="4" w:space="0" w:color="auto"/>
         <w:left w:val="single" w:sz="4" w:space="0" w:color="auto"/>
@@ -10271,6 +10037,12 @@
         <w:insideH w:val="single" w:sz="4" w:space="0" w:color="auto"/>
         <w:insideV w:val="single" w:sz="4" w:space="0" w:color="auto"/>
       </w:tblBorders>
+      <w:tblCellMar>
+        <w:top w:w="0" w:type="dxa"/>
+        <w:left w:w="108" w:type="dxa"/>
+        <w:bottom w:w="0" w:type="dxa"/>
+        <w:right w:w="108" w:type="dxa"/>
+      </w:tblCellMar>
     </w:tblPr>
   </w:style>
   <w:style w:type="character" w:styleId="TextodoEspaoReservado">
@@ -10289,166 +10061,6 @@
 <file path=word/glossary/document.xml><?xml version="1.0" encoding="utf-8"?>
 <w:glossaryDocument xmlns:wpc="http://schemas.microsoft.com/office/word/2010/wordprocessingCanvas" xmlns:mc="http://schemas.openxmlformats.org/markup-compatibility/2006" xmlns:o="urn:schemas-microsoft-com:office:office" xmlns:r="http://schemas.openxmlformats.org/officeDocument/2006/relationships" xmlns:m="http://schemas.openxmlformats.org/officeDocument/2006/math" xmlns:v="urn:schemas-microsoft-com:vml" xmlns:wp14="http://schemas.microsoft.com/office/word/2010/wordprocessingDrawing" xmlns:wp="http://schemas.openxmlformats.org/drawingml/2006/wordprocessingDrawing" xmlns:w10="urn:schemas-microsoft-com:office:word" xmlns:w="http://schemas.openxmlformats.org/wordprocessingml/2006/main" xmlns:w14="http://schemas.microsoft.com/office/word/2010/wordml" xmlns:w15="http://schemas.microsoft.com/office/word/2012/wordml" xmlns:wpg="http://schemas.microsoft.com/office/word/2010/wordprocessingGroup" xmlns:wpi="http://schemas.microsoft.com/office/word/2010/wordprocessingInk" xmlns:wne="http://schemas.microsoft.com/office/word/2006/wordml" xmlns:wps="http://schemas.microsoft.com/office/word/2010/wordprocessingShape" mc:Ignorable="w14 w15 wp14">
   <w:docParts>
-    <w:docPart>
-      <w:docPartPr>
-        <w:name w:val="F3A7F4FAD40B44EF967D9C55057DBDC2"/>
-        <w:category>
-          <w:name w:val="Geral"/>
-          <w:gallery w:val="placeholder"/>
-        </w:category>
-        <w:types>
-          <w:type w:val="bbPlcHdr"/>
-        </w:types>
-        <w:behaviors>
-          <w:behavior w:val="content"/>
-        </w:behaviors>
-        <w:guid w:val="{41C07D1B-0547-410C-9221-A8D144518483}"/>
-      </w:docPartPr>
-      <w:docPartBody>
-        <w:p>
-          <w:pPr>
-            <w:pStyle w:val="F3A7F4FAD40B44EF967D9C55057DBDC2"/>
-          </w:pPr>
-          <w:r>
-            <w:rPr>
-              <w:rStyle w:val="TextodoEspaoReservado"/>
-              <w:color w:val="FF0000"/>
-              <w:sz w:val="20"/>
-              <w:szCs w:val="18"/>
-            </w:rPr>
-            <w:t>Não informado</w:t>
-          </w:r>
-        </w:p>
-      </w:docPartBody>
-    </w:docPart>
-    <w:docPart>
-      <w:docPartPr>
-        <w:name w:val="45F5F3A12813424DBA42D293A84D9F56"/>
-        <w:category>
-          <w:name w:val="Geral"/>
-          <w:gallery w:val="placeholder"/>
-        </w:category>
-        <w:types>
-          <w:type w:val="bbPlcHdr"/>
-        </w:types>
-        <w:behaviors>
-          <w:behavior w:val="content"/>
-        </w:behaviors>
-        <w:guid w:val="{C9248939-A208-488A-B5F3-AE5C0F53702A}"/>
-      </w:docPartPr>
-      <w:docPartBody>
-        <w:p>
-          <w:pPr>
-            <w:pStyle w:val="45F5F3A12813424DBA42D293A84D9F56"/>
-          </w:pPr>
-          <w:r>
-            <w:rPr>
-              <w:rStyle w:val="TextodoEspaoReservado"/>
-              <w:color w:val="FF0000"/>
-              <w:sz w:val="20"/>
-              <w:szCs w:val="18"/>
-            </w:rPr>
-            <w:t>Não informado</w:t>
-          </w:r>
-        </w:p>
-      </w:docPartBody>
-    </w:docPart>
-    <w:docPart>
-      <w:docPartPr>
-        <w:name w:val="F1BB48D52FB54292B90B90DB3DCCB4BD"/>
-        <w:category>
-          <w:name w:val="Geral"/>
-          <w:gallery w:val="placeholder"/>
-        </w:category>
-        <w:types>
-          <w:type w:val="bbPlcHdr"/>
-        </w:types>
-        <w:behaviors>
-          <w:behavior w:val="content"/>
-        </w:behaviors>
-        <w:guid w:val="{C548C4B1-11E4-43C8-BC9A-9256AE5081A0}"/>
-      </w:docPartPr>
-      <w:docPartBody>
-        <w:p>
-          <w:pPr>
-            <w:pStyle w:val="F1BB48D52FB54292B90B90DB3DCCB4BD"/>
-          </w:pPr>
-          <w:r>
-            <w:rPr>
-              <w:rStyle w:val="TextodoEspaoReservado"/>
-              <w:color w:val="FF0000"/>
-              <w:sz w:val="20"/>
-              <w:szCs w:val="18"/>
-            </w:rPr>
-            <w:t>Não informado</w:t>
-          </w:r>
-        </w:p>
-      </w:docPartBody>
-    </w:docPart>
-    <w:docPart>
-      <w:docPartPr>
-        <w:name w:val="DCCEB62F54AA41B8A251841466474F8C"/>
-        <w:category>
-          <w:name w:val="Geral"/>
-          <w:gallery w:val="placeholder"/>
-        </w:category>
-        <w:types>
-          <w:type w:val="bbPlcHdr"/>
-        </w:types>
-        <w:behaviors>
-          <w:behavior w:val="content"/>
-        </w:behaviors>
-        <w:guid w:val="{89477674-415E-4C83-869E-0F180E5C8330}"/>
-      </w:docPartPr>
-      <w:docPartBody>
-        <w:p>
-          <w:pPr>
-            <w:pStyle w:val="DCCEB62F54AA41B8A251841466474F8C"/>
-          </w:pPr>
-          <w:r>
-            <w:rPr>
-              <w:rStyle w:val="TextodoEspaoReservado"/>
-              <w:color w:val="FF0000"/>
-              <w:sz w:val="20"/>
-              <w:szCs w:val="20"/>
-            </w:rPr>
-            <w:t>XXX.XXX.XXX-XX</w:t>
-          </w:r>
-        </w:p>
-      </w:docPartBody>
-    </w:docPart>
-    <w:docPart>
-      <w:docPartPr>
-        <w:name w:val="154D342A038E4AB6852AF0530437EF3C"/>
-        <w:category>
-          <w:name w:val="Geral"/>
-          <w:gallery w:val="placeholder"/>
-        </w:category>
-        <w:types>
-          <w:type w:val="bbPlcHdr"/>
-        </w:types>
-        <w:behaviors>
-          <w:behavior w:val="content"/>
-        </w:behaviors>
-        <w:guid w:val="{A2D2281C-9AEB-4EE3-9731-985EB9B9931F}"/>
-      </w:docPartPr>
-      <w:docPartBody>
-        <w:p>
-          <w:pPr>
-            <w:pStyle w:val="154D342A038E4AB6852AF0530437EF3C"/>
-          </w:pPr>
-          <w:r>
-            <w:rPr>
-              <w:rStyle w:val="TextodoEspaoReservado"/>
-              <w:color w:val="FF0000"/>
-              <w:sz w:val="20"/>
-              <w:szCs w:val="20"/>
-            </w:rPr>
-            <w:t>Rua, nº XX, complemento, Bairro, Cidade, Estado, CEP 00000-000</w:t>
-          </w:r>
-        </w:p>
-      </w:docPartBody>
-    </w:docPart>
     <w:docPart>
       <w:docPartPr>
         <w:name w:val="853456B134784E45B5D1C2183E0643C7"/>
@@ -10509,230 +10121,6 @@
               <w:szCs w:val="20"/>
             </w:rPr>
             <w:t>(00) 00000-0000</w:t>
-          </w:r>
-        </w:p>
-      </w:docPartBody>
-    </w:docPart>
-    <w:docPart>
-      <w:docPartPr>
-        <w:name w:val="80623B6CB0C44442BA335C637B39D8FC"/>
-        <w:category>
-          <w:name w:val="Geral"/>
-          <w:gallery w:val="placeholder"/>
-        </w:category>
-        <w:types>
-          <w:type w:val="bbPlcHdr"/>
-        </w:types>
-        <w:behaviors>
-          <w:behavior w:val="content"/>
-        </w:behaviors>
-        <w:guid w:val="{75D891AC-26C8-41A8-91E6-1170EAE70D02}"/>
-      </w:docPartPr>
-      <w:docPartBody>
-        <w:p>
-          <w:pPr>
-            <w:pStyle w:val="80623B6CB0C44442BA335C637B39D8FC"/>
-          </w:pPr>
-          <w:r>
-            <w:rPr>
-              <w:rStyle w:val="TextodoEspaoReservado"/>
-              <w:color w:val="FF0000"/>
-              <w:sz w:val="20"/>
-              <w:szCs w:val="18"/>
-            </w:rPr>
-            <w:t>Não informado</w:t>
-          </w:r>
-        </w:p>
-      </w:docPartBody>
-    </w:docPart>
-    <w:docPart>
-      <w:docPartPr>
-        <w:name w:val="34AE27DFE71D450C87C802E5D980BC74"/>
-        <w:category>
-          <w:name w:val="Geral"/>
-          <w:gallery w:val="placeholder"/>
-        </w:category>
-        <w:types>
-          <w:type w:val="bbPlcHdr"/>
-        </w:types>
-        <w:behaviors>
-          <w:behavior w:val="content"/>
-        </w:behaviors>
-        <w:guid w:val="{2E479748-A1FD-4C67-8412-23DBC4205B97}"/>
-      </w:docPartPr>
-      <w:docPartBody>
-        <w:p>
-          <w:pPr>
-            <w:pStyle w:val="34AE27DFE71D450C87C802E5D980BC74"/>
-          </w:pPr>
-          <w:r>
-            <w:rPr>
-              <w:rStyle w:val="TextodoEspaoReservado"/>
-              <w:color w:val="FF0000"/>
-              <w:sz w:val="20"/>
-              <w:szCs w:val="18"/>
-            </w:rPr>
-            <w:t>Não informado</w:t>
-          </w:r>
-        </w:p>
-      </w:docPartBody>
-    </w:docPart>
-    <w:docPart>
-      <w:docPartPr>
-        <w:name w:val="9804FF69A977486791AB1DEC2744F98D"/>
-        <w:category>
-          <w:name w:val="Geral"/>
-          <w:gallery w:val="placeholder"/>
-        </w:category>
-        <w:types>
-          <w:type w:val="bbPlcHdr"/>
-        </w:types>
-        <w:behaviors>
-          <w:behavior w:val="content"/>
-        </w:behaviors>
-        <w:guid w:val="{935F59FC-5777-4149-85F3-778C8EFA4F0F}"/>
-      </w:docPartPr>
-      <w:docPartBody>
-        <w:p>
-          <w:pPr>
-            <w:pStyle w:val="9804FF69A977486791AB1DEC2744F98D"/>
-          </w:pPr>
-          <w:r>
-            <w:rPr>
-              <w:rStyle w:val="TextodoEspaoReservado"/>
-              <w:color w:val="FF0000"/>
-              <w:sz w:val="20"/>
-              <w:szCs w:val="18"/>
-            </w:rPr>
-            <w:t>Não informado</w:t>
-          </w:r>
-        </w:p>
-      </w:docPartBody>
-    </w:docPart>
-    <w:docPart>
-      <w:docPartPr>
-        <w:name w:val="1FCAF0F37CF34C6DB790933AE39503C7"/>
-        <w:category>
-          <w:name w:val="Geral"/>
-          <w:gallery w:val="placeholder"/>
-        </w:category>
-        <w:types>
-          <w:type w:val="bbPlcHdr"/>
-        </w:types>
-        <w:behaviors>
-          <w:behavior w:val="content"/>
-        </w:behaviors>
-        <w:guid w:val="{A448CE17-5FAB-4DE6-AF3E-CEA9F1639A3B}"/>
-      </w:docPartPr>
-      <w:docPartBody>
-        <w:p>
-          <w:pPr>
-            <w:pStyle w:val="1FCAF0F37CF34C6DB790933AE39503C7"/>
-          </w:pPr>
-          <w:r>
-            <w:rPr>
-              <w:rStyle w:val="TextodoEspaoReservado"/>
-              <w:color w:val="FF0000"/>
-              <w:sz w:val="20"/>
-              <w:szCs w:val="18"/>
-            </w:rPr>
-            <w:t>Não informado</w:t>
-          </w:r>
-        </w:p>
-      </w:docPartBody>
-    </w:docPart>
-    <w:docPart>
-      <w:docPartPr>
-        <w:name w:val="CF6EC5BF030542CAAE98B2FC40B47F83"/>
-        <w:category>
-          <w:name w:val="Geral"/>
-          <w:gallery w:val="placeholder"/>
-        </w:category>
-        <w:types>
-          <w:type w:val="bbPlcHdr"/>
-        </w:types>
-        <w:behaviors>
-          <w:behavior w:val="content"/>
-        </w:behaviors>
-        <w:guid w:val="{0D6F2296-D9E9-42F4-8587-9FC96F07CB5A}"/>
-      </w:docPartPr>
-      <w:docPartBody>
-        <w:p>
-          <w:pPr>
-            <w:pStyle w:val="CF6EC5BF030542CAAE98B2FC40B47F83"/>
-          </w:pPr>
-          <w:r>
-            <w:rPr>
-              <w:rStyle w:val="TextodoEspaoReservado"/>
-              <w:color w:val="FF0000"/>
-              <w:sz w:val="20"/>
-              <w:szCs w:val="20"/>
-            </w:rPr>
-            <w:t>XXX.XXX.XXX-XX</w:t>
-          </w:r>
-        </w:p>
-      </w:docPartBody>
-    </w:docPart>
-    <w:docPart>
-      <w:docPartPr>
-        <w:name w:val="DE328453E8AD4EF485DD12097C0AD9CF"/>
-        <w:category>
-          <w:name w:val="Geral"/>
-          <w:gallery w:val="placeholder"/>
-        </w:category>
-        <w:types>
-          <w:type w:val="bbPlcHdr"/>
-        </w:types>
-        <w:behaviors>
-          <w:behavior w:val="content"/>
-        </w:behaviors>
-        <w:guid w:val="{BE1A384C-5AD5-475B-8E12-737B1F445477}"/>
-      </w:docPartPr>
-      <w:docPartBody>
-        <w:p>
-          <w:pPr>
-            <w:pStyle w:val="DE328453E8AD4EF485DD12097C0AD9CF"/>
-          </w:pPr>
-          <w:r>
-            <w:rPr>
-              <w:rStyle w:val="TextodoEspaoReservado"/>
-              <w:color w:val="FF0000"/>
-              <w:sz w:val="20"/>
-              <w:szCs w:val="18"/>
-            </w:rPr>
-            <w:t>XXXXX</w:t>
-          </w:r>
-        </w:p>
-      </w:docPartBody>
-    </w:docPart>
-    <w:docPart>
-      <w:docPartPr>
-        <w:name w:val="F8645BFEC27B4D44866DD3516027E4B2"/>
-        <w:category>
-          <w:name w:val="Geral"/>
-          <w:gallery w:val="placeholder"/>
-        </w:category>
-        <w:types>
-          <w:type w:val="bbPlcHdr"/>
-        </w:types>
-        <w:behaviors>
-          <w:behavior w:val="content"/>
-        </w:behaviors>
-        <w:guid w:val="{537F5A85-273E-4D9A-9155-DADF42CDC361}"/>
-      </w:docPartPr>
-      <w:docPartBody>
-        <w:p>
-          <w:pPr>
-            <w:pStyle w:val="F8645BFEC27B4D44866DD3516027E4B2"/>
-          </w:pPr>
-          <w:r>
-            <w:rPr>
-              <w:rStyle w:val="TextodoEspaoReservado"/>
-              <w:color w:val="FF0000"/>
-              <w:sz w:val="20"/>
-              <w:szCs w:val="20"/>
-            </w:rPr>
-            <w:t>Rua, nº XX, complemento, Bairro, Cidade, Estado, CEP 00000-000</w:t>
           </w:r>
         </w:p>
       </w:docPartBody>
@@ -10801,166 +10189,6 @@
         </w:p>
       </w:docPartBody>
     </w:docPart>
-    <w:docPart>
-      <w:docPartPr>
-        <w:name w:val="C5497176C40542C88D9C06E3599B5759"/>
-        <w:category>
-          <w:name w:val="Geral"/>
-          <w:gallery w:val="placeholder"/>
-        </w:category>
-        <w:types>
-          <w:type w:val="bbPlcHdr"/>
-        </w:types>
-        <w:behaviors>
-          <w:behavior w:val="content"/>
-        </w:behaviors>
-        <w:guid w:val="{90EC8647-F3D4-4F4F-88E1-98D680129DC9}"/>
-      </w:docPartPr>
-      <w:docPartBody>
-        <w:p>
-          <w:pPr>
-            <w:pStyle w:val="C5497176C40542C88D9C06E3599B5759"/>
-          </w:pPr>
-          <w:r>
-            <w:rPr>
-              <w:rStyle w:val="TextodoEspaoReservado"/>
-              <w:color w:val="FF0000"/>
-              <w:sz w:val="20"/>
-              <w:szCs w:val="18"/>
-            </w:rPr>
-            <w:t>Não informado</w:t>
-          </w:r>
-        </w:p>
-      </w:docPartBody>
-    </w:docPart>
-    <w:docPart>
-      <w:docPartPr>
-        <w:name w:val="6E87224A90E144E9B54BB898B7BBBA0C"/>
-        <w:category>
-          <w:name w:val="Geral"/>
-          <w:gallery w:val="placeholder"/>
-        </w:category>
-        <w:types>
-          <w:type w:val="bbPlcHdr"/>
-        </w:types>
-        <w:behaviors>
-          <w:behavior w:val="content"/>
-        </w:behaviors>
-        <w:guid w:val="{E58D5D68-01BE-4947-8956-7665728E82FF}"/>
-      </w:docPartPr>
-      <w:docPartBody>
-        <w:p>
-          <w:pPr>
-            <w:pStyle w:val="6E87224A90E144E9B54BB898B7BBBA0C"/>
-          </w:pPr>
-          <w:r>
-            <w:rPr>
-              <w:rStyle w:val="TextodoEspaoReservado"/>
-              <w:color w:val="FF0000"/>
-              <w:sz w:val="20"/>
-              <w:szCs w:val="18"/>
-            </w:rPr>
-            <w:t>Não informado</w:t>
-          </w:r>
-        </w:p>
-      </w:docPartBody>
-    </w:docPart>
-    <w:docPart>
-      <w:docPartPr>
-        <w:name w:val="0052BC3DE60148BC83DBF45C97CA0818"/>
-        <w:category>
-          <w:name w:val="Geral"/>
-          <w:gallery w:val="placeholder"/>
-        </w:category>
-        <w:types>
-          <w:type w:val="bbPlcHdr"/>
-        </w:types>
-        <w:behaviors>
-          <w:behavior w:val="content"/>
-        </w:behaviors>
-        <w:guid w:val="{BD314C5D-FFFC-4E98-9310-AF27C554CE84}"/>
-      </w:docPartPr>
-      <w:docPartBody>
-        <w:p>
-          <w:pPr>
-            <w:pStyle w:val="0052BC3DE60148BC83DBF45C97CA0818"/>
-          </w:pPr>
-          <w:r>
-            <w:rPr>
-              <w:rStyle w:val="TextodoEspaoReservado"/>
-              <w:color w:val="FF0000"/>
-              <w:sz w:val="20"/>
-              <w:szCs w:val="18"/>
-            </w:rPr>
-            <w:t>Não informado</w:t>
-          </w:r>
-        </w:p>
-      </w:docPartBody>
-    </w:docPart>
-    <w:docPart>
-      <w:docPartPr>
-        <w:name w:val="10C515A1ACF741AB91C58EE91568B185"/>
-        <w:category>
-          <w:name w:val="Geral"/>
-          <w:gallery w:val="placeholder"/>
-        </w:category>
-        <w:types>
-          <w:type w:val="bbPlcHdr"/>
-        </w:types>
-        <w:behaviors>
-          <w:behavior w:val="content"/>
-        </w:behaviors>
-        <w:guid w:val="{38DB79A4-1722-413B-913C-2F2DCF1174C7}"/>
-      </w:docPartPr>
-      <w:docPartBody>
-        <w:p>
-          <w:pPr>
-            <w:pStyle w:val="10C515A1ACF741AB91C58EE91568B185"/>
-          </w:pPr>
-          <w:r>
-            <w:rPr>
-              <w:rStyle w:val="TextodoEspaoReservado"/>
-              <w:color w:val="FF0000"/>
-              <w:sz w:val="20"/>
-              <w:szCs w:val="18"/>
-            </w:rPr>
-            <w:t>Não informado</w:t>
-          </w:r>
-        </w:p>
-      </w:docPartBody>
-    </w:docPart>
-    <w:docPart>
-      <w:docPartPr>
-        <w:name w:val="DA6D1B3189ED424A829937D633B5A5CC"/>
-        <w:category>
-          <w:name w:val="Geral"/>
-          <w:gallery w:val="placeholder"/>
-        </w:category>
-        <w:types>
-          <w:type w:val="bbPlcHdr"/>
-        </w:types>
-        <w:behaviors>
-          <w:behavior w:val="content"/>
-        </w:behaviors>
-        <w:guid w:val="{1851C497-6180-4E4C-AC17-9D79706EAB9F}"/>
-      </w:docPartPr>
-      <w:docPartBody>
-        <w:p>
-          <w:pPr>
-            <w:pStyle w:val="DA6D1B3189ED424A829937D633B5A5CC"/>
-          </w:pPr>
-          <w:r>
-            <w:rPr>
-              <w:rStyle w:val="TextodoEspaoReservado"/>
-              <w:color w:val="FF0000"/>
-              <w:sz w:val="20"/>
-              <w:szCs w:val="18"/>
-            </w:rPr>
-            <w:t>Não informado</w:t>
-          </w:r>
-        </w:p>
-      </w:docPartBody>
-    </w:docPart>
   </w:docParts>
 </w:glossaryDocument>
 </file>
@@ -11010,10 +10238,11 @@
   </w:font>
   <w:font w:name="Gill Sans MT">
     <w:altName w:val="Segoe UI"/>
+    <w:panose1 w:val="020B0502020104020203"/>
     <w:charset w:val="00"/>
     <w:family w:val="swiss"/>
     <w:pitch w:val="variable"/>
-    <w:sig w:usb0="00000001" w:usb1="00000000" w:usb2="00000000" w:usb3="00000000" w:csb0="00000003" w:csb1="00000000"/>
+    <w:sig w:usb0="00000007" w:usb1="00000000" w:usb2="00000000" w:usb3="00000000" w:csb0="00000003" w:csb1="00000000"/>
   </w:font>
   <w:font w:name="Tahoma">
     <w:panose1 w:val="020B0604030504040204"/>
@@ -11062,9 +10291,11 @@
   </w:compat>
   <w:rsids>
     <w:rsidRoot w:val="00A65186"/>
+    <w:rsid w:val="00335E9E"/>
     <w:rsid w:val="00352476"/>
     <w:rsid w:val="003A1E32"/>
     <w:rsid w:val="003B3B83"/>
+    <w:rsid w:val="003D4551"/>
     <w:rsid w:val="00475E96"/>
     <w:rsid w:val="006D5398"/>
     <w:rsid w:val="0089498B"/>
@@ -11522,7 +10753,7 @@
     <w:basedOn w:val="Fontepargpadro"/>
     <w:uiPriority w:val="99"/>
     <w:semiHidden/>
-    <w:rsid w:val="00F30527"/>
+    <w:rsid w:val="003D4551"/>
     <w:rPr>
       <w:color w:val="666666"/>
     </w:rPr>
@@ -11810,6 +11041,18 @@
   <w:style w:type="paragraph" w:customStyle="1" w:styleId="DA6D1B3189ED424A829937D633B5A5CC">
     <w:name w:val="DA6D1B3189ED424A829937D633B5A5CC"/>
     <w:rsid w:val="00F30527"/>
+  </w:style>
+  <w:style w:type="paragraph" w:customStyle="1" w:styleId="D3B0B8AD823441908DF645338D10D930">
+    <w:name w:val="D3B0B8AD823441908DF645338D10D930"/>
+    <w:rsid w:val="003D4551"/>
+  </w:style>
+  <w:style w:type="paragraph" w:customStyle="1" w:styleId="956C852FF341424787670E704986CA2B">
+    <w:name w:val="956C852FF341424787670E704986CA2B"/>
+    <w:rsid w:val="003D4551"/>
+  </w:style>
+  <w:style w:type="paragraph" w:customStyle="1" w:styleId="703E39AC669B4678BAD6BB731715E9E2">
+    <w:name w:val="703E39AC669B4678BAD6BB731715E9E2"/>
+    <w:rsid w:val="003D4551"/>
   </w:style>
 </w:styles>
 </file>

</xml_diff>

<commit_message>
Add broker selector; expand aluguel render
App.vue: add a Corretor selector (corretores list sorted alphabetically) and an atualizarDadosCorretor method to autofill broker name/CRECI/CPF into the form; remove the old manual broker input card and wire dataAssinatura. Include a disabled placeholder option and model binding for the selected broker. Update public/modelo.docx (binary) accordingly.

logic/aluguel.js: improve extenso fallback handling and significantly expand doc.render mapping to include additional financial, property, locador, locatário and corretor fields (many new placeholders), plus minor comment/formatting tweaks to support richer contract generation.
</commit_message>
<xml_diff>
--- a/public/modelo.docx
+++ b/public/modelo.docx
@@ -1048,27 +1048,20 @@
               </w:rPr>
               <w:t xml:space="preserve"> </w:t>
             </w:r>
-            <w:sdt>
-              <w:sdtPr>
-                <w:rPr>
-                  <w:rFonts w:eastAsia="Times New Roman"/>
-                </w:rPr>
-                <w:id w:val="-1603332660"/>
-                <w:placeholder>
-                  <w:docPart w:val="0AAB6AE43F23476C83983B1980B1573A"/>
-                </w:placeholder>
-                <w:text/>
-              </w:sdtPr>
-              <w:sdtEndPr/>
-              <w:sdtContent>
-                <w:r>
-                  <w:rPr>
-                    <w:rFonts w:eastAsia="Times New Roman"/>
-                  </w:rPr>
-                  <w:t>{TelefoneLocatario}</w:t>
-                </w:r>
-              </w:sdtContent>
-            </w:sdt>
+            <w:r>
+              <w:rPr>
+                <w:rFonts w:eastAsia="Times New Roman"/>
+              </w:rPr>
+              <w:t>{Telef</w:t>
+            </w:r>
+            <w:bookmarkStart w:id="2" w:name="_GoBack"/>
+            <w:bookmarkEnd w:id="2"/>
+            <w:r>
+              <w:rPr>
+                <w:rFonts w:eastAsia="Times New Roman"/>
+              </w:rPr>
+              <w:t>oneLocatario}</w:t>
+            </w:r>
           </w:p>
         </w:tc>
       </w:tr>
@@ -1514,7 +1507,7 @@
                 <w:rFonts w:eastAsia="Times New Roman"/>
               </w:rPr>
             </w:pPr>
-            <w:bookmarkStart w:id="2" w:name="_Hlk163802821"/>
+            <w:bookmarkStart w:id="3" w:name="_Hlk163802821"/>
             <w:r>
               <w:rPr>
                 <w:szCs w:val="18"/>
@@ -1669,7 +1662,7 @@
           </w:p>
         </w:tc>
       </w:tr>
-      <w:bookmarkEnd w:id="2"/>
+      <w:bookmarkEnd w:id="3"/>
     </w:tbl>
     <w:p/>
     <w:p>
@@ -2132,18 +2125,7 @@
           <w:sz w:val="20"/>
           <w:szCs w:val="20"/>
         </w:rPr>
-        <w:t>DataFimLocaca</w:t>
-      </w:r>
-      <w:bookmarkStart w:id="3" w:name="_GoBack"/>
-      <w:bookmarkEnd w:id="3"/>
-      <w:r>
-        <w:rPr>
-          <w:b/>
-          <w:color w:val="FF0000"/>
-          <w:sz w:val="20"/>
-          <w:szCs w:val="20"/>
-        </w:rPr>
-        <w:t>o}</w:t>
+        <w:t>DataFimLocacao}</w:t>
       </w:r>
       <w:r>
         <w:rPr>
@@ -8268,7 +8250,7 @@
         </mc:Choice>
         <mc:Fallback>
           <w:pict>
-            <v:line w14:anchorId="287E1B4A" id="Line 3" o:spid="_x0000_s1026" style="position:absolute;z-index:251659264;visibility:visible;mso-wrap-style:square;mso-wrap-distance-left:9pt;mso-wrap-distance-top:0;mso-wrap-distance-right:9pt;mso-wrap-distance-bottom:0;mso-position-horizontal:left;mso-position-horizontal-relative:margin;mso-position-vertical:absolute;mso-position-vertical-relative:text" from="0,-.2pt" to="486pt,-.2pt" o:gfxdata="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" strokeweight=".48pt">
+            <v:line w14:anchorId="351EC0FD" id="Line 3" o:spid="_x0000_s1026" style="position:absolute;z-index:251659264;visibility:visible;mso-wrap-style:square;mso-wrap-distance-left:9pt;mso-wrap-distance-top:0;mso-wrap-distance-right:9pt;mso-wrap-distance-bottom:0;mso-position-horizontal:left;mso-position-horizontal-relative:margin;mso-position-vertical:absolute;mso-position-vertical-relative:text" from="0,-.2pt" to="486pt,-.2pt" o:gfxdata="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" strokeweight=".48pt">
               <w10:wrap anchorx="margin"/>
             </v:line>
           </w:pict>
@@ -8345,7 +8327,7 @@
                 <w:sz w:val="20"/>
                 <w:szCs w:val="20"/>
               </w:rPr>
-              <w:t>2</w:t>
+              <w:t>1</w:t>
             </w:r>
             <w:r>
               <w:rPr>
@@ -8547,7 +8529,7 @@
         </mc:Choice>
         <mc:Fallback>
           <w:pict>
-            <v:shape w14:anchorId="4626AE5C" id="Graphic 1" o:spid="_x0000_s1026" style="position:absolute;margin-left:26.15pt;margin-top:27.55pt;width:537.15pt;height:16.45pt;z-index:251653120;visibility:visible;mso-wrap-style:square;mso-wrap-distance-left:0;mso-wrap-distance-top:0;mso-wrap-distance-right:0;mso-wrap-distance-bottom:0;mso-position-horizontal:absolute;mso-position-horizontal-relative:page;mso-position-vertical:absolute;mso-position-vertical-relative:page;v-text-anchor:top" coordsize="6821805,208915" o:gfxdata="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" path="m6821805,l,,,208915r6821805,l6821805,xe" fillcolor="#dc1c2d" stroked="f">
+            <v:shape w14:anchorId="01C85A7A" id="Graphic 1" o:spid="_x0000_s1026" style="position:absolute;margin-left:26.15pt;margin-top:27.55pt;width:537.15pt;height:16.45pt;z-index:251653120;visibility:visible;mso-wrap-style:square;mso-wrap-distance-left:0;mso-wrap-distance-top:0;mso-wrap-distance-right:0;mso-wrap-distance-bottom:0;mso-position-horizontal:absolute;mso-position-horizontal-relative:page;mso-position-vertical:absolute;mso-position-vertical-relative:page;v-text-anchor:top" coordsize="6821805,208915" o:gfxdata="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" path="m6821805,l,,,208915r6821805,l6821805,xe" fillcolor="#dc1c2d" stroked="f">
               <v:path arrowok="t"/>
               <w10:wrap anchorx="page" anchory="page"/>
             </v:shape>
@@ -10157,38 +10139,6 @@
         </w:p>
       </w:docPartBody>
     </w:docPart>
-    <w:docPart>
-      <w:docPartPr>
-        <w:name w:val="0AAB6AE43F23476C83983B1980B1573A"/>
-        <w:category>
-          <w:name w:val="Geral"/>
-          <w:gallery w:val="placeholder"/>
-        </w:category>
-        <w:types>
-          <w:type w:val="bbPlcHdr"/>
-        </w:types>
-        <w:behaviors>
-          <w:behavior w:val="content"/>
-        </w:behaviors>
-        <w:guid w:val="{B027F116-C4AA-41E5-9201-15A767DAB883}"/>
-      </w:docPartPr>
-      <w:docPartBody>
-        <w:p>
-          <w:pPr>
-            <w:pStyle w:val="0AAB6AE43F23476C83983B1980B1573A"/>
-          </w:pPr>
-          <w:r>
-            <w:rPr>
-              <w:rStyle w:val="TextodoEspaoReservado"/>
-              <w:color w:val="808080" w:themeColor="background1" w:themeShade="80"/>
-              <w:sz w:val="20"/>
-              <w:szCs w:val="20"/>
-            </w:rPr>
-            <w:t>(00) 00000-0000</w:t>
-          </w:r>
-        </w:p>
-      </w:docPartBody>
-    </w:docPart>
   </w:docParts>
 </w:glossaryDocument>
 </file>
@@ -10291,6 +10241,7 @@
   </w:compat>
   <w:rsids>
     <w:rsidRoot w:val="00A65186"/>
+    <w:rsid w:val="00035705"/>
     <w:rsid w:val="00335E9E"/>
     <w:rsid w:val="00352476"/>
     <w:rsid w:val="003A1E32"/>

</xml_diff>

<commit_message>
Add guarantee option and DOCX generation
Add UI to select guarantee type (SEGURO LOCATÍCIO or CAUÇÃO) with months input and default form values; include button styles for active states (src/App.vue, src/styles/remax.css). Update rental document generation logic (src/logic/aluguel.js) to: clean and format rental value, generate extenso via a helper, handle caução calculations/text, inject TextoSeguro into the DOCX template, and simplify error messaging. Also update the Word template binary (public/modelo.docx) to match the new tag(s).
</commit_message>
<xml_diff>
--- a/public/modelo.docx
+++ b/public/modelo.docx
@@ -1052,15 +1052,7 @@
               <w:rPr>
                 <w:rFonts w:eastAsia="Times New Roman"/>
               </w:rPr>
-              <w:t>{Telef</w:t>
-            </w:r>
-            <w:bookmarkStart w:id="2" w:name="_GoBack"/>
-            <w:bookmarkEnd w:id="2"/>
-            <w:r>
-              <w:rPr>
-                <w:rFonts w:eastAsia="Times New Roman"/>
-              </w:rPr>
-              <w:t>oneLocatario}</w:t>
+              <w:t>{TelefoneLocatario}</w:t>
             </w:r>
           </w:p>
         </w:tc>
@@ -1507,7 +1499,7 @@
                 <w:rFonts w:eastAsia="Times New Roman"/>
               </w:rPr>
             </w:pPr>
-            <w:bookmarkStart w:id="3" w:name="_Hlk163802821"/>
+            <w:bookmarkStart w:id="2" w:name="_Hlk163802821"/>
             <w:r>
               <w:rPr>
                 <w:szCs w:val="18"/>
@@ -1662,7 +1654,7 @@
           </w:p>
         </w:tc>
       </w:tr>
-      <w:bookmarkEnd w:id="3"/>
+      <w:bookmarkEnd w:id="2"/>
     </w:tbl>
     <w:p/>
     <w:p>
@@ -1858,6 +1850,21 @@
       </w:r>
       <w:r>
         <w:rPr>
+          <w:sz w:val="20"/>
+          <w:szCs w:val="20"/>
+        </w:rPr>
+        <w:t xml:space="preserve">composta por </w:t>
+      </w:r>
+      <w:r>
+        <w:rPr>
+          <w:color w:val="FF0000"/>
+          <w:sz w:val="20"/>
+          <w:szCs w:val="20"/>
+        </w:rPr>
+        <w:t xml:space="preserve"> </w:t>
+      </w:r>
+      <w:r>
+        <w:rPr>
           <w:color w:val="FF0000"/>
           <w:sz w:val="20"/>
           <w:szCs w:val="20"/>
@@ -2143,7 +2150,7 @@
         </w:rPr>
         <w:t xml:space="preserve">a a qual o imóvel deverá ser devolvido nas condições previstas na </w:t>
       </w:r>
-      <w:bookmarkStart w:id="4" w:name="_Hlk164342918"/>
+      <w:bookmarkStart w:id="3" w:name="_Hlk164342918"/>
       <w:r>
         <w:rPr>
           <w:b/>
@@ -2168,7 +2175,7 @@
         </w:rPr>
         <w:t xml:space="preserve"> 7ª</w:t>
       </w:r>
-      <w:bookmarkEnd w:id="4"/>
+      <w:bookmarkEnd w:id="3"/>
       <w:r>
         <w:rPr>
           <w:bCs/>
@@ -2514,155 +2521,22 @@
         <w:autoSpaceDN/>
         <w:spacing w:before="240" w:line="252" w:lineRule="auto"/>
         <w:rPr>
-          <w:sz w:val="20"/>
-          <w:szCs w:val="20"/>
-        </w:rPr>
-      </w:pPr>
-      <w:r>
-        <w:rPr>
-          <w:bCs/>
-          <w:sz w:val="20"/>
-          <w:szCs w:val="20"/>
-        </w:rPr>
-        <w:t xml:space="preserve">O </w:t>
-      </w:r>
-      <w:r>
-        <w:rPr>
-          <w:b/>
-          <w:sz w:val="20"/>
-          <w:szCs w:val="20"/>
-        </w:rPr>
-        <w:t>LOCATÁRIO</w:t>
-      </w:r>
-      <w:r>
-        <w:rPr>
-          <w:sz w:val="20"/>
-          <w:szCs w:val="20"/>
-        </w:rPr>
-        <w:t xml:space="preserve"> se compromete a pagar </w:t>
-      </w:r>
-      <w:r>
-        <w:rPr>
           <w:color w:val="FF0000"/>
           <w:sz w:val="20"/>
           <w:szCs w:val="20"/>
         </w:rPr>
-        <w:t>junto com o 1º mês de aluguel antecipado</w:t>
-      </w:r>
-      <w:r>
-        <w:rPr>
-          <w:sz w:val="20"/>
-          <w:szCs w:val="20"/>
-        </w:rPr>
-        <w:t xml:space="preserve">, a caução no valor de </w:t>
-      </w:r>
-      <w:r>
-        <w:rPr>
-          <w:b/>
-          <w:bCs/>
+      </w:pPr>
+      <w:bookmarkStart w:id="4" w:name="_GoBack"/>
+      <w:r>
+        <w:rPr>
           <w:color w:val="FF0000"/>
           <w:sz w:val="20"/>
           <w:szCs w:val="20"/>
         </w:rPr>
-        <w:t>R$</w:t>
-      </w:r>
-      <w:r>
-        <w:rPr>
-          <w:b/>
-          <w:bCs/>
-          <w:color w:val="FF0000"/>
-          <w:sz w:val="20"/>
-          <w:szCs w:val="20"/>
-        </w:rPr>
-        <w:t xml:space="preserve"> </w:t>
-      </w:r>
-      <w:r>
-        <w:rPr>
-          <w:b/>
-          <w:bCs/>
-          <w:color w:val="FF0000"/>
-          <w:sz w:val="20"/>
-          <w:szCs w:val="20"/>
-        </w:rPr>
-        <w:t>X.XXX,00 (</w:t>
-      </w:r>
-      <w:r>
-        <w:rPr>
-          <w:b/>
-          <w:bCs/>
-          <w:color w:val="FF0000"/>
-          <w:sz w:val="20"/>
-          <w:szCs w:val="20"/>
-        </w:rPr>
-        <w:t>valor por extenso</w:t>
-      </w:r>
-      <w:r>
-        <w:rPr>
-          <w:b/>
-          <w:bCs/>
-          <w:color w:val="FF0000"/>
-          <w:sz w:val="20"/>
-          <w:szCs w:val="20"/>
-        </w:rPr>
-        <w:t>)</w:t>
-      </w:r>
-      <w:r>
-        <w:rPr>
-          <w:sz w:val="20"/>
-          <w:szCs w:val="20"/>
-        </w:rPr>
-        <w:t>,</w:t>
-      </w:r>
-      <w:r>
-        <w:rPr>
-          <w:sz w:val="20"/>
-          <w:szCs w:val="20"/>
-        </w:rPr>
-        <w:t xml:space="preserve"> </w:t>
-      </w:r>
-      <w:r>
-        <w:rPr>
-          <w:sz w:val="20"/>
-          <w:szCs w:val="20"/>
-        </w:rPr>
-        <w:t>que servirá como garantia a quaisquer danos ao imóvel, e despesas</w:t>
-      </w:r>
-      <w:r>
-        <w:rPr>
-          <w:sz w:val="20"/>
-          <w:szCs w:val="20"/>
-        </w:rPr>
-        <w:t xml:space="preserve"> inerentes a utilização do imóvel e despesas de consumo</w:t>
-      </w:r>
-      <w:r>
-        <w:rPr>
-          <w:sz w:val="20"/>
-          <w:szCs w:val="20"/>
-        </w:rPr>
-        <w:t>.</w:t>
-      </w:r>
-      <w:r>
-        <w:rPr>
-          <w:sz w:val="20"/>
-          <w:szCs w:val="20"/>
-        </w:rPr>
-        <w:t xml:space="preserve">, conforme </w:t>
-      </w:r>
-      <w:r>
-        <w:rPr>
-          <w:sz w:val="20"/>
-          <w:szCs w:val="20"/>
-        </w:rPr>
-        <w:t>artigo 38, § 2º da Lei do Inquilinato</w:t>
-      </w:r>
-      <w:r>
-        <w:rPr>
-          <w:sz w:val="20"/>
-          <w:szCs w:val="20"/>
-        </w:rPr>
-        <w:t>.</w:t>
-      </w:r>
-    </w:p>
+        <w:t>{TextoSeguro}</w:t>
+      </w:r>
+    </w:p>
+    <w:bookmarkEnd w:id="4"/>
     <w:p>
       <w:pPr>
         <w:pStyle w:val="PargrafodaLista"/>
@@ -3081,7 +2955,6 @@
           <w:sz w:val="20"/>
           <w:szCs w:val="20"/>
         </w:rPr>
-        <w:lastRenderedPageBreak/>
         <w:t>{DiaMensalPagamentoAluguel}</w:t>
       </w:r>
       <w:r>
@@ -3138,6 +3011,7 @@
           <w:bCs/>
           <w:sz w:val="20"/>
         </w:rPr>
+        <w:lastRenderedPageBreak/>
         <w:t xml:space="preserve">CLÁUSULA </w:t>
       </w:r>
       <w:r>
@@ -4266,6 +4140,7 @@
           <w:sz w:val="20"/>
           <w:szCs w:val="20"/>
         </w:rPr>
+        <w:lastRenderedPageBreak/>
         <w:t>O</w:t>
       </w:r>
       <w:r>
@@ -5350,6 +5225,7 @@
           <w:sz w:val="20"/>
           <w:szCs w:val="20"/>
         </w:rPr>
+        <w:lastRenderedPageBreak/>
         <w:t>A renovação contratual, entretanto, não será automática, podendo o</w:t>
       </w:r>
       <w:r>
@@ -6250,7 +6126,6 @@
           <w:sz w:val="20"/>
           <w:szCs w:val="20"/>
         </w:rPr>
-        <w:lastRenderedPageBreak/>
         <w:t xml:space="preserve">Caso </w:t>
       </w:r>
       <w:r>
@@ -6443,6 +6318,7 @@
           <w:sz w:val="20"/>
           <w:szCs w:val="20"/>
         </w:rPr>
+        <w:lastRenderedPageBreak/>
         <w:t xml:space="preserve">O pagamento da multa rescisória não exonera o(a) </w:t>
       </w:r>
       <w:r>
@@ -7233,7 +7109,6 @@
           <w:sz w:val="20"/>
           <w:szCs w:val="20"/>
         </w:rPr>
-        <w:lastRenderedPageBreak/>
         <w:t xml:space="preserve">Nenhuma das </w:t>
       </w:r>
       <w:r>
@@ -7351,6 +7226,7 @@
           <w:sz w:val="20"/>
           <w:szCs w:val="20"/>
         </w:rPr>
+        <w:lastRenderedPageBreak/>
         <w:t xml:space="preserve">As atribuições e obrigações contratuais das partes </w:t>
       </w:r>
       <w:r>
@@ -7887,7 +7763,6 @@
         <w:jc w:val="center"/>
       </w:pPr>
       <w:r>
-        <w:lastRenderedPageBreak/>
         <w:t>________________________</w:t>
       </w:r>
     </w:p>
@@ -8250,7 +8125,7 @@
         </mc:Choice>
         <mc:Fallback>
           <w:pict>
-            <v:line w14:anchorId="351EC0FD" id="Line 3" o:spid="_x0000_s1026" style="position:absolute;z-index:251659264;visibility:visible;mso-wrap-style:square;mso-wrap-distance-left:9pt;mso-wrap-distance-top:0;mso-wrap-distance-right:9pt;mso-wrap-distance-bottom:0;mso-position-horizontal:left;mso-position-horizontal-relative:margin;mso-position-vertical:absolute;mso-position-vertical-relative:text" from="0,-.2pt" to="486pt,-.2pt" o:gfxdata="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" strokeweight=".48pt">
+            <v:line w14:anchorId="5AE1B1E7" id="Line 3" o:spid="_x0000_s1026" style="position:absolute;z-index:251659264;visibility:visible;mso-wrap-style:square;mso-wrap-distance-left:9pt;mso-wrap-distance-top:0;mso-wrap-distance-right:9pt;mso-wrap-distance-bottom:0;mso-position-horizontal:left;mso-position-horizontal-relative:margin;mso-position-vertical:absolute;mso-position-vertical-relative:text" from="0,-.2pt" to="486pt,-.2pt" o:gfxdata="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" strokeweight=".48pt">
               <w10:wrap anchorx="margin"/>
             </v:line>
           </w:pict>
@@ -8327,7 +8202,7 @@
                 <w:sz w:val="20"/>
                 <w:szCs w:val="20"/>
               </w:rPr>
-              <w:t>1</w:t>
+              <w:t>7</w:t>
             </w:r>
             <w:r>
               <w:rPr>
@@ -8343,7 +8218,14 @@
                 <w:sz w:val="20"/>
                 <w:szCs w:val="20"/>
               </w:rPr>
-              <w:t xml:space="preserve"> de </w:t>
+              <w:t xml:space="preserve"> </w:t>
+            </w:r>
+            <w:r>
+              <w:rPr>
+                <w:sz w:val="20"/>
+                <w:szCs w:val="20"/>
+              </w:rPr>
+              <w:t xml:space="preserve">de </w:t>
             </w:r>
             <w:r>
               <w:rPr>
@@ -8380,7 +8262,7 @@
                 <w:sz w:val="20"/>
                 <w:szCs w:val="20"/>
               </w:rPr>
-              <w:t>8</w:t>
+              <w:t>7</w:t>
             </w:r>
             <w:r>
               <w:rPr>
@@ -8529,7 +8411,7 @@
         </mc:Choice>
         <mc:Fallback>
           <w:pict>
-            <v:shape w14:anchorId="01C85A7A" id="Graphic 1" o:spid="_x0000_s1026" style="position:absolute;margin-left:26.15pt;margin-top:27.55pt;width:537.15pt;height:16.45pt;z-index:251653120;visibility:visible;mso-wrap-style:square;mso-wrap-distance-left:0;mso-wrap-distance-top:0;mso-wrap-distance-right:0;mso-wrap-distance-bottom:0;mso-position-horizontal:absolute;mso-position-horizontal-relative:page;mso-position-vertical:absolute;mso-position-vertical-relative:page;v-text-anchor:top" coordsize="6821805,208915" o:gfxdata="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" path="m6821805,l,,,208915r6821805,l6821805,xe" fillcolor="#dc1c2d" stroked="f">
+            <v:shape w14:anchorId="7C846305" id="Graphic 1" o:spid="_x0000_s1026" style="position:absolute;margin-left:26.15pt;margin-top:27.55pt;width:537.15pt;height:16.45pt;z-index:251653120;visibility:visible;mso-wrap-style:square;mso-wrap-distance-left:0;mso-wrap-distance-top:0;mso-wrap-distance-right:0;mso-wrap-distance-bottom:0;mso-position-horizontal:absolute;mso-position-horizontal-relative:page;mso-position-vertical:absolute;mso-position-vertical-relative:page;v-text-anchor:top" coordsize="6821805,208915" o:gfxdata="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" path="m6821805,l,,,208915r6821805,l6821805,xe" fillcolor="#dc1c2d" stroked="f">
               <v:path arrowok="t"/>
               <w10:wrap anchorx="page" anchory="page"/>
             </v:shape>
@@ -10248,11 +10130,14 @@
     <w:rsid w:val="003B3B83"/>
     <w:rsid w:val="003D4551"/>
     <w:rsid w:val="00475E96"/>
+    <w:rsid w:val="004D5DB1"/>
     <w:rsid w:val="006D5398"/>
     <w:rsid w:val="0089498B"/>
     <w:rsid w:val="00963D45"/>
     <w:rsid w:val="009D57A0"/>
     <w:rsid w:val="00A65186"/>
+    <w:rsid w:val="00CA64C0"/>
+    <w:rsid w:val="00D15C4B"/>
     <w:rsid w:val="00F26E06"/>
     <w:rsid w:val="00F30527"/>
     <w:rsid w:val="00FB7E04"/>

</xml_diff>